<commit_message>
docs: finalize article and experiment artifacts
</commit_message>
<xml_diff>
--- a/article/Artigo_Pentaho_vs_Databricks_Final.docx
+++ b/article/Artigo_Pentaho_vs_Databricks_Final.docx
@@ -128,7 +128,7 @@
     <w:p>
       <w:pPr>
         <w:spacing w:after="0" w:line="360" w:lineRule="auto"/>
-        <w:jc w:val="both"/>
+        <w:jc w:val="center"/>
         <w:rPr>
           <w:rFonts w:ascii="Times New Roman" w:hAnsi="Times New Roman" w:cs="Times New Roman"/>
           <w:b/>
@@ -565,7 +565,7 @@
     <w:p>
       <w:pPr>
         <w:spacing w:after="0" w:line="360" w:lineRule="auto"/>
-        <w:jc w:val="both"/>
+        <w:jc w:val="center"/>
         <w:rPr>
           <w:rFonts w:ascii="Times New Roman" w:hAnsi="Times New Roman" w:cs="Times New Roman"/>
           <w:b/>
@@ -909,7 +909,21 @@
           <w:rFonts w:ascii="Times New Roman" w:hAnsi="Times New Roman" w:cs="Times New Roman"/>
           <w:lang w:val="pt-BR"/>
         </w:rPr>
-        <w:t xml:space="preserve"> constitui uma plataforma de engenharia e análise de dados que utiliza tecnologias como o Apache Spark para o processamento de grandes conjuntos de dados por meio de operações distribuídas (DATABRICKS, 2026). Essa diferença de abordagem levanta uma questão relevante: como o </w:t>
+        <w:t xml:space="preserve"> constitui uma plataforma de engenharia e análise de dados que utiliza tecnologias como o Apache Spark para o processamento de grandes conjuntos de dados por meio de operações distribuídas (DATABRICKS, 2026</w:t>
+      </w:r>
+      <w:r>
+        <w:rPr>
+          <w:rFonts w:ascii="Times New Roman" w:hAnsi="Times New Roman" w:cs="Times New Roman"/>
+          <w:lang w:val="pt-BR"/>
+        </w:rPr>
+        <w:t>a</w:t>
+      </w:r>
+      <w:r>
+        <w:rPr>
+          <w:rFonts w:ascii="Times New Roman" w:hAnsi="Times New Roman" w:cs="Times New Roman"/>
+          <w:lang w:val="pt-BR"/>
+        </w:rPr>
+        <w:t xml:space="preserve">). Essa diferença de abordagem levanta uma questão relevante: como o </w:t>
       </w:r>
       <w:proofErr w:type="spellStart"/>
       <w:r>
@@ -2327,7 +2341,7 @@
           <w:bCs/>
           <w:lang w:val="pt-BR"/>
         </w:rPr>
-        <w:t>2.6 D</w:t>
+        <w:t xml:space="preserve">2.6 </w:t>
       </w:r>
       <w:proofErr w:type="spellStart"/>
       <w:r>
@@ -2337,7 +2351,7 @@
           <w:bCs/>
           <w:lang w:val="pt-BR"/>
         </w:rPr>
-        <w:t>atabricks</w:t>
+        <w:t>Databricks</w:t>
       </w:r>
       <w:proofErr w:type="spellEnd"/>
       <w:r>
@@ -2407,7 +2421,21 @@
           <w:rFonts w:ascii="Times New Roman" w:hAnsi="Times New Roman" w:cs="Times New Roman"/>
           <w:lang w:val="pt-BR"/>
         </w:rPr>
-        <w:t xml:space="preserve"> em diferentes cargas de trabalho de dados (DATABRICKS, 2026).</w:t>
+        <w:t xml:space="preserve"> em diferentes cargas de trabalho de dados (DATABRICKS, 2026</w:t>
+      </w:r>
+      <w:r>
+        <w:rPr>
+          <w:rFonts w:ascii="Times New Roman" w:hAnsi="Times New Roman" w:cs="Times New Roman"/>
+          <w:lang w:val="pt-BR"/>
+        </w:rPr>
+        <w:t>a</w:t>
+      </w:r>
+      <w:r>
+        <w:rPr>
+          <w:rFonts w:ascii="Times New Roman" w:hAnsi="Times New Roman" w:cs="Times New Roman"/>
+          <w:lang w:val="pt-BR"/>
+        </w:rPr>
+        <w:t>).</w:t>
       </w:r>
     </w:p>
     <w:p>
@@ -3575,7 +3603,21 @@
           <w:rFonts w:ascii="Times New Roman" w:hAnsi="Times New Roman" w:cs="Times New Roman"/>
           <w:lang w:val="pt-BR"/>
         </w:rPr>
-        <w:t>, cuja infraestrutura é gerenciada pela plataforma (DATABRICKS, 2026).</w:t>
+        <w:t xml:space="preserve">, cuja infraestrutura é gerenciada pela plataforma </w:t>
+      </w:r>
+      <w:r>
+        <w:rPr>
+          <w:rFonts w:ascii="Times New Roman" w:hAnsi="Times New Roman" w:cs="Times New Roman"/>
+          <w:lang w:val="pt-BR"/>
+        </w:rPr>
+        <w:t>(DATABRICKS, 2026b; DATABRICKS, 2026c)</w:t>
+      </w:r>
+      <w:r>
+        <w:rPr>
+          <w:rFonts w:ascii="Times New Roman" w:hAnsi="Times New Roman" w:cs="Times New Roman"/>
+          <w:lang w:val="pt-BR"/>
+        </w:rPr>
+        <w:t>.</w:t>
       </w:r>
     </w:p>
     <w:p>
@@ -4130,6 +4172,7 @@
       <w:r>
         <w:rPr>
           <w:rFonts w:ascii="Times New Roman" w:hAnsi="Times New Roman" w:cs="Times New Roman"/>
+          <w:noProof/>
           <w:lang w:val="pt-BR"/>
         </w:rPr>
         <w:drawing>
@@ -4704,6 +4747,16 @@
               </w:rPr>
               <w:t>100</w:t>
             </w:r>
+            <w:r>
+              <w:rPr>
+                <w:rFonts w:ascii="Times New Roman" w:eastAsia="Times New Roman" w:hAnsi="Times New Roman" w:cs="Times New Roman"/>
+                <w:color w:val="000000"/>
+                <w:kern w:val="0"/>
+                <w:lang w:eastAsia="en-CA"/>
+                <w14:ligatures w14:val="none"/>
+              </w:rPr>
+              <w:t>.000</w:t>
+            </w:r>
           </w:p>
         </w:tc>
       </w:tr>
@@ -4857,6 +4910,16 @@
                 <w14:ligatures w14:val="none"/>
               </w:rPr>
               <w:t>500</w:t>
+            </w:r>
+            <w:r>
+              <w:rPr>
+                <w:rFonts w:ascii="Times New Roman" w:eastAsia="Times New Roman" w:hAnsi="Times New Roman" w:cs="Times New Roman"/>
+                <w:color w:val="000000"/>
+                <w:kern w:val="0"/>
+                <w:lang w:eastAsia="en-CA"/>
+                <w14:ligatures w14:val="none"/>
+              </w:rPr>
+              <w:t>.000</w:t>
             </w:r>
           </w:p>
         </w:tc>
@@ -6341,10 +6404,11 @@
           <w:rFonts w:ascii="Times New Roman" w:hAnsi="Times New Roman" w:cs="Times New Roman"/>
           <w:b/>
           <w:bCs/>
+          <w:noProof/>
           <w:lang w:val="pt-BR"/>
         </w:rPr>
         <w:drawing>
-          <wp:anchor distT="0" distB="0" distL="114300" distR="114300" simplePos="0" relativeHeight="251659264" behindDoc="0" locked="0" layoutInCell="1" allowOverlap="1" wp14:anchorId="7D57FF2E" wp14:editId="7FD11A3C">
+          <wp:anchor distT="0" distB="0" distL="114300" distR="114300" simplePos="0" relativeHeight="251659264" behindDoc="0" locked="0" layoutInCell="1" allowOverlap="1" wp14:anchorId="7D57FF2E" wp14:editId="08B9266A">
             <wp:simplePos x="0" y="0"/>
             <wp:positionH relativeFrom="margin">
               <wp:posOffset>-600075</wp:posOffset>
@@ -6884,6 +6948,7 @@
           <w:rFonts w:ascii="Times New Roman" w:hAnsi="Times New Roman" w:cs="Times New Roman"/>
           <w:b/>
           <w:bCs/>
+          <w:noProof/>
           <w:lang w:val="pt-BR"/>
         </w:rPr>
         <w:drawing>
@@ -7143,6 +7208,7 @@
           <w:rFonts w:ascii="Times New Roman" w:hAnsi="Times New Roman" w:cs="Times New Roman"/>
           <w:b/>
           <w:bCs/>
+          <w:noProof/>
           <w:lang w:val="pt-BR"/>
         </w:rPr>
         <w:lastRenderedPageBreak/>
@@ -9000,6 +9066,18 @@
               </w:rPr>
               <w:t>100</w:t>
             </w:r>
+            <w:r>
+              <w:rPr>
+                <w:rFonts w:ascii="Aptos Narrow" w:eastAsia="Times New Roman" w:hAnsi="Aptos Narrow" w:cs="Times New Roman"/>
+                <w:color w:val="000000"/>
+                <w:kern w:val="0"/>
+                <w:sz w:val="22"/>
+                <w:szCs w:val="22"/>
+                <w:lang w:eastAsia="en-CA"/>
+                <w14:ligatures w14:val="none"/>
+              </w:rPr>
+              <w:t>.000</w:t>
+            </w:r>
           </w:p>
         </w:tc>
         <w:tc>
@@ -9210,6 +9288,18 @@
                 <w14:ligatures w14:val="none"/>
               </w:rPr>
               <w:t>500</w:t>
+            </w:r>
+            <w:r>
+              <w:rPr>
+                <w:rFonts w:ascii="Aptos Narrow" w:eastAsia="Times New Roman" w:hAnsi="Aptos Narrow" w:cs="Times New Roman"/>
+                <w:color w:val="000000"/>
+                <w:kern w:val="0"/>
+                <w:sz w:val="22"/>
+                <w:szCs w:val="22"/>
+                <w:lang w:eastAsia="en-CA"/>
+                <w14:ligatures w14:val="none"/>
+              </w:rPr>
+              <w:t>.000</w:t>
             </w:r>
           </w:p>
         </w:tc>
@@ -9973,6 +10063,7 @@
           <w:rFonts w:ascii="Times New Roman" w:hAnsi="Times New Roman" w:cs="Times New Roman"/>
           <w:b/>
           <w:bCs/>
+          <w:noProof/>
           <w:lang w:val="pt-BR"/>
         </w:rPr>
         <w:drawing>
@@ -13049,56 +13140,6 @@
     <w:p>
       <w:pPr>
         <w:spacing w:after="0" w:line="360" w:lineRule="auto"/>
-        <w:ind w:firstLine="720"/>
-        <w:jc w:val="both"/>
-        <w:rPr>
-          <w:rFonts w:ascii="Times New Roman" w:hAnsi="Times New Roman" w:cs="Times New Roman"/>
-          <w:lang w:val="pt-BR"/>
-        </w:rPr>
-      </w:pPr>
-      <w:r>
-        <w:rPr>
-          <w:rFonts w:ascii="Times New Roman" w:hAnsi="Times New Roman" w:cs="Times New Roman"/>
-          <w:lang w:val="pt-BR"/>
-        </w:rPr>
-        <w:t xml:space="preserve">A principal mudança que fiz foi adicionar Singu (2021) e </w:t>
-      </w:r>
-      <w:proofErr w:type="spellStart"/>
-      <w:r>
-        <w:rPr>
-          <w:rFonts w:ascii="Times New Roman" w:hAnsi="Times New Roman" w:cs="Times New Roman"/>
-          <w:lang w:val="pt-BR"/>
-        </w:rPr>
-        <w:t>Tlemcani</w:t>
-      </w:r>
-      <w:proofErr w:type="spellEnd"/>
-      <w:r>
-        <w:rPr>
-          <w:rFonts w:ascii="Times New Roman" w:hAnsi="Times New Roman" w:cs="Times New Roman"/>
-          <w:lang w:val="pt-BR"/>
-        </w:rPr>
-        <w:t xml:space="preserve"> et al. (2026) na discussão. Acho importante: nós trouxemos referências novas para a fundamentação justamente para que elas não ficassem apenas “decorando” a revisão bibliográfica. Aqui mostramos que nossos achados dialogam com a literatura, mas imediatamente colocamos o freio metodológico: não sabemos se foi Spark, </w:t>
-      </w:r>
-      <w:proofErr w:type="spellStart"/>
-      <w:r>
-        <w:rPr>
-          <w:rFonts w:ascii="Times New Roman" w:hAnsi="Times New Roman" w:cs="Times New Roman"/>
-          <w:lang w:val="pt-BR"/>
-        </w:rPr>
-        <w:t>Serverless</w:t>
-      </w:r>
-      <w:proofErr w:type="spellEnd"/>
-      <w:r>
-        <w:rPr>
-          <w:rFonts w:ascii="Times New Roman" w:hAnsi="Times New Roman" w:cs="Times New Roman"/>
-          <w:lang w:val="pt-BR"/>
-        </w:rPr>
-        <w:t>, Delta, recursos alocados etc. que causaram o comportamento.</w:t>
-      </w:r>
-    </w:p>
-    <w:p>
-      <w:pPr>
-        <w:spacing w:after="0" w:line="360" w:lineRule="auto"/>
         <w:jc w:val="both"/>
         <w:rPr>
           <w:rFonts w:ascii="Times New Roman" w:hAnsi="Times New Roman" w:cs="Times New Roman"/>
@@ -13124,505 +13165,507 @@
           <w:bCs/>
           <w:lang w:val="pt-BR"/>
         </w:rPr>
-        <w:t xml:space="preserve">5 </w:t>
-      </w:r>
-      <w:r>
+        <w:t>5 CONCLUSÃO</w:t>
+      </w:r>
+    </w:p>
+    <w:p>
+      <w:pPr>
+        <w:spacing w:after="0" w:line="360" w:lineRule="auto"/>
+        <w:jc w:val="both"/>
+        <w:rPr>
+          <w:rFonts w:ascii="Times New Roman" w:hAnsi="Times New Roman" w:cs="Times New Roman"/>
+          <w:lang w:val="pt-BR"/>
+        </w:rPr>
+      </w:pPr>
+    </w:p>
+    <w:p>
+      <w:pPr>
+        <w:spacing w:after="0" w:line="360" w:lineRule="auto"/>
+        <w:ind w:firstLine="720"/>
+        <w:jc w:val="both"/>
+        <w:rPr>
+          <w:rFonts w:ascii="Times New Roman" w:hAnsi="Times New Roman" w:cs="Times New Roman"/>
+          <w:lang w:val="pt-BR"/>
+        </w:rPr>
+      </w:pPr>
+      <w:r>
+        <w:rPr>
+          <w:rFonts w:ascii="Times New Roman" w:hAnsi="Times New Roman" w:cs="Times New Roman"/>
+          <w:lang w:val="pt-BR"/>
+        </w:rPr>
+        <w:t xml:space="preserve">Este estudo teve como objetivo comparar o desempenho do </w:t>
+      </w:r>
+      <w:proofErr w:type="spellStart"/>
+      <w:r>
+        <w:rPr>
+          <w:rFonts w:ascii="Times New Roman" w:hAnsi="Times New Roman" w:cs="Times New Roman"/>
+          <w:lang w:val="pt-BR"/>
+        </w:rPr>
+        <w:t>Pentaho</w:t>
+      </w:r>
+      <w:proofErr w:type="spellEnd"/>
+      <w:r>
+        <w:rPr>
+          <w:rFonts w:ascii="Times New Roman" w:hAnsi="Times New Roman" w:cs="Times New Roman"/>
+          <w:lang w:val="pt-BR"/>
+        </w:rPr>
+        <w:t xml:space="preserve"> Data </w:t>
+      </w:r>
+      <w:proofErr w:type="spellStart"/>
+      <w:r>
+        <w:rPr>
+          <w:rFonts w:ascii="Times New Roman" w:hAnsi="Times New Roman" w:cs="Times New Roman"/>
+          <w:lang w:val="pt-BR"/>
+        </w:rPr>
+        <w:t>Integration</w:t>
+      </w:r>
+      <w:proofErr w:type="spellEnd"/>
+      <w:r>
+        <w:rPr>
+          <w:rFonts w:ascii="Times New Roman" w:hAnsi="Times New Roman" w:cs="Times New Roman"/>
+          <w:lang w:val="pt-BR"/>
+        </w:rPr>
+        <w:t xml:space="preserve"> e do </w:t>
+      </w:r>
+      <w:proofErr w:type="spellStart"/>
+      <w:r>
+        <w:rPr>
+          <w:rFonts w:ascii="Times New Roman" w:hAnsi="Times New Roman" w:cs="Times New Roman"/>
+          <w:lang w:val="pt-BR"/>
+        </w:rPr>
+        <w:t>Databricks</w:t>
+      </w:r>
+      <w:proofErr w:type="spellEnd"/>
+      <w:r>
+        <w:rPr>
+          <w:rFonts w:ascii="Times New Roman" w:hAnsi="Times New Roman" w:cs="Times New Roman"/>
+          <w:lang w:val="pt-BR"/>
+        </w:rPr>
+        <w:t xml:space="preserve"> na execução de processos ETL submetidos a diferentes volumes de dados. Para isso, foram implementados processos logicamente equivalentes nas duas plataformas, utilizando os mesmos conjuntos de dados sintéticos e as mesmas regras principais de transformação. A utilização de dados determinísticos, validações de consistência, execução de aquecimento e três repetições medidas por cenário permitiu estruturar uma comparação reproduzível dentro das condições experimentais adotadas.</w:t>
+      </w:r>
+    </w:p>
+    <w:p>
+      <w:pPr>
+        <w:spacing w:after="0" w:line="360" w:lineRule="auto"/>
+        <w:ind w:firstLine="720"/>
+        <w:jc w:val="both"/>
+        <w:rPr>
+          <w:rFonts w:ascii="Times New Roman" w:hAnsi="Times New Roman" w:cs="Times New Roman"/>
+          <w:lang w:val="pt-BR"/>
+        </w:rPr>
+      </w:pPr>
+      <w:r>
+        <w:rPr>
+          <w:rFonts w:ascii="Times New Roman" w:hAnsi="Times New Roman" w:cs="Times New Roman"/>
+          <w:lang w:val="pt-BR"/>
+        </w:rPr>
+        <w:t xml:space="preserve">Os resultados demonstraram comportamentos distintos conforme o volume processado aumentou. No cenário de 100 mil transações, o </w:t>
+      </w:r>
+      <w:proofErr w:type="spellStart"/>
+      <w:r>
+        <w:rPr>
+          <w:rFonts w:ascii="Times New Roman" w:hAnsi="Times New Roman" w:cs="Times New Roman"/>
+          <w:lang w:val="pt-BR"/>
+        </w:rPr>
+        <w:t>Pentaho</w:t>
+      </w:r>
+      <w:proofErr w:type="spellEnd"/>
+      <w:r>
+        <w:rPr>
+          <w:rFonts w:ascii="Times New Roman" w:hAnsi="Times New Roman" w:cs="Times New Roman"/>
+          <w:lang w:val="pt-BR"/>
+        </w:rPr>
+        <w:t xml:space="preserve"> apresentou menor tempo médio </w:t>
+      </w:r>
+      <w:proofErr w:type="spellStart"/>
+      <w:r>
+        <w:rPr>
+          <w:rFonts w:ascii="Times New Roman" w:hAnsi="Times New Roman" w:cs="Times New Roman"/>
+          <w:lang w:val="pt-BR"/>
+        </w:rPr>
+        <w:t>end-to-end</w:t>
+      </w:r>
+      <w:proofErr w:type="spellEnd"/>
+      <w:r>
+        <w:rPr>
+          <w:rFonts w:ascii="Times New Roman" w:hAnsi="Times New Roman" w:cs="Times New Roman"/>
+          <w:lang w:val="pt-BR"/>
+        </w:rPr>
+        <w:t xml:space="preserve">, com 3,667 segundos, contra 4,793 segundos do </w:t>
+      </w:r>
+      <w:proofErr w:type="spellStart"/>
+      <w:r>
+        <w:rPr>
+          <w:rFonts w:ascii="Times New Roman" w:hAnsi="Times New Roman" w:cs="Times New Roman"/>
+          <w:lang w:val="pt-BR"/>
+        </w:rPr>
+        <w:t>Databricks</w:t>
+      </w:r>
+      <w:proofErr w:type="spellEnd"/>
+      <w:r>
+        <w:rPr>
+          <w:rFonts w:ascii="Times New Roman" w:hAnsi="Times New Roman" w:cs="Times New Roman"/>
+          <w:lang w:val="pt-BR"/>
+        </w:rPr>
+        <w:t xml:space="preserve">. Entretanto, essa relação se inverteu a partir do cenário de 500 mil transações e as diferenças aumentaram nos volumes </w:t>
+      </w:r>
+      <w:r>
+        <w:rPr>
+          <w:rFonts w:ascii="Times New Roman" w:hAnsi="Times New Roman" w:cs="Times New Roman"/>
+          <w:lang w:val="pt-BR"/>
+        </w:rPr>
+        <w:lastRenderedPageBreak/>
+        <w:t xml:space="preserve">seguintes. No cenário de 5 milhões de transações, o </w:t>
+      </w:r>
+      <w:proofErr w:type="spellStart"/>
+      <w:r>
+        <w:rPr>
+          <w:rFonts w:ascii="Times New Roman" w:hAnsi="Times New Roman" w:cs="Times New Roman"/>
+          <w:lang w:val="pt-BR"/>
+        </w:rPr>
+        <w:t>Databricks</w:t>
+      </w:r>
+      <w:proofErr w:type="spellEnd"/>
+      <w:r>
+        <w:rPr>
+          <w:rFonts w:ascii="Times New Roman" w:hAnsi="Times New Roman" w:cs="Times New Roman"/>
+          <w:lang w:val="pt-BR"/>
+        </w:rPr>
+        <w:t xml:space="preserve"> registrou tempo médio </w:t>
+      </w:r>
+      <w:proofErr w:type="spellStart"/>
+      <w:r>
+        <w:rPr>
+          <w:rFonts w:ascii="Times New Roman" w:hAnsi="Times New Roman" w:cs="Times New Roman"/>
+          <w:lang w:val="pt-BR"/>
+        </w:rPr>
+        <w:t>end-to-end</w:t>
+      </w:r>
+      <w:proofErr w:type="spellEnd"/>
+      <w:r>
+        <w:rPr>
+          <w:rFonts w:ascii="Times New Roman" w:hAnsi="Times New Roman" w:cs="Times New Roman"/>
+          <w:lang w:val="pt-BR"/>
+        </w:rPr>
+        <w:t xml:space="preserve"> de 8,695 segundos, enquanto o </w:t>
+      </w:r>
+      <w:proofErr w:type="spellStart"/>
+      <w:r>
+        <w:rPr>
+          <w:rFonts w:ascii="Times New Roman" w:hAnsi="Times New Roman" w:cs="Times New Roman"/>
+          <w:lang w:val="pt-BR"/>
+        </w:rPr>
+        <w:t>Pentaho</w:t>
+      </w:r>
+      <w:proofErr w:type="spellEnd"/>
+      <w:r>
+        <w:rPr>
+          <w:rFonts w:ascii="Times New Roman" w:hAnsi="Times New Roman" w:cs="Times New Roman"/>
+          <w:lang w:val="pt-BR"/>
+        </w:rPr>
+        <w:t xml:space="preserve"> registrou 174,333 segundos.</w:t>
+      </w:r>
+    </w:p>
+    <w:p>
+      <w:pPr>
+        <w:spacing w:after="0" w:line="360" w:lineRule="auto"/>
+        <w:ind w:firstLine="720"/>
+        <w:jc w:val="both"/>
+        <w:rPr>
+          <w:rFonts w:ascii="Times New Roman" w:hAnsi="Times New Roman" w:cs="Times New Roman"/>
+          <w:lang w:val="pt-BR"/>
+        </w:rPr>
+      </w:pPr>
+      <w:r>
+        <w:rPr>
+          <w:rFonts w:ascii="Times New Roman" w:hAnsi="Times New Roman" w:cs="Times New Roman"/>
+          <w:lang w:val="pt-BR"/>
+        </w:rPr>
+        <w:t xml:space="preserve">Entre o menor e o maior cenário, o volume de transações aumentou 50 vezes. Nesse intervalo, o tempo médio </w:t>
+      </w:r>
+      <w:proofErr w:type="spellStart"/>
+      <w:r>
+        <w:rPr>
+          <w:rFonts w:ascii="Times New Roman" w:hAnsi="Times New Roman" w:cs="Times New Roman"/>
+          <w:lang w:val="pt-BR"/>
+        </w:rPr>
+        <w:t>end-to-end</w:t>
+      </w:r>
+      <w:proofErr w:type="spellEnd"/>
+      <w:r>
+        <w:rPr>
+          <w:rFonts w:ascii="Times New Roman" w:hAnsi="Times New Roman" w:cs="Times New Roman"/>
+          <w:lang w:val="pt-BR"/>
+        </w:rPr>
+        <w:t xml:space="preserve"> do </w:t>
+      </w:r>
+      <w:proofErr w:type="spellStart"/>
+      <w:r>
+        <w:rPr>
+          <w:rFonts w:ascii="Times New Roman" w:hAnsi="Times New Roman" w:cs="Times New Roman"/>
+          <w:lang w:val="pt-BR"/>
+        </w:rPr>
+        <w:t>Databricks</w:t>
+      </w:r>
+      <w:proofErr w:type="spellEnd"/>
+      <w:r>
+        <w:rPr>
+          <w:rFonts w:ascii="Times New Roman" w:hAnsi="Times New Roman" w:cs="Times New Roman"/>
+          <w:lang w:val="pt-BR"/>
+        </w:rPr>
+        <w:t xml:space="preserve"> aumentou aproximadamente 81,4%, passando de 4,793 para 8,695 segundos. No </w:t>
+      </w:r>
+      <w:proofErr w:type="spellStart"/>
+      <w:r>
+        <w:rPr>
+          <w:rFonts w:ascii="Times New Roman" w:hAnsi="Times New Roman" w:cs="Times New Roman"/>
+          <w:lang w:val="pt-BR"/>
+        </w:rPr>
+        <w:t>Pentaho</w:t>
+      </w:r>
+      <w:proofErr w:type="spellEnd"/>
+      <w:r>
+        <w:rPr>
+          <w:rFonts w:ascii="Times New Roman" w:hAnsi="Times New Roman" w:cs="Times New Roman"/>
+          <w:lang w:val="pt-BR"/>
+        </w:rPr>
+        <w:t xml:space="preserve">, o tempo do maior cenário correspondeu a aproximadamente 47,5 vezes o tempo observado no menor. A análise das etapas mostrou ainda que o crescimento do tempo no </w:t>
+      </w:r>
+      <w:proofErr w:type="spellStart"/>
+      <w:r>
+        <w:rPr>
+          <w:rFonts w:ascii="Times New Roman" w:hAnsi="Times New Roman" w:cs="Times New Roman"/>
+          <w:lang w:val="pt-BR"/>
+        </w:rPr>
+        <w:t>Pentaho</w:t>
+      </w:r>
+      <w:proofErr w:type="spellEnd"/>
+      <w:r>
+        <w:rPr>
+          <w:rFonts w:ascii="Times New Roman" w:hAnsi="Times New Roman" w:cs="Times New Roman"/>
+          <w:lang w:val="pt-BR"/>
+        </w:rPr>
+        <w:t xml:space="preserve"> foi especialmente acentuado na etapa Silver-</w:t>
+      </w:r>
+      <w:proofErr w:type="spellStart"/>
+      <w:r>
+        <w:rPr>
+          <w:rFonts w:ascii="Times New Roman" w:hAnsi="Times New Roman" w:cs="Times New Roman"/>
+          <w:lang w:val="pt-BR"/>
+        </w:rPr>
+        <w:t>to</w:t>
+      </w:r>
+      <w:proofErr w:type="spellEnd"/>
+      <w:r>
+        <w:rPr>
+          <w:rFonts w:ascii="Times New Roman" w:hAnsi="Times New Roman" w:cs="Times New Roman"/>
+          <w:lang w:val="pt-BR"/>
+        </w:rPr>
+        <w:t xml:space="preserve">-Gold, enquanto essa etapa permaneceu próxima de dois segundos no ambiente </w:t>
+      </w:r>
+      <w:proofErr w:type="spellStart"/>
+      <w:r>
+        <w:rPr>
+          <w:rFonts w:ascii="Times New Roman" w:hAnsi="Times New Roman" w:cs="Times New Roman"/>
+          <w:lang w:val="pt-BR"/>
+        </w:rPr>
+        <w:t>Databricks</w:t>
+      </w:r>
+      <w:proofErr w:type="spellEnd"/>
+      <w:r>
+        <w:rPr>
+          <w:rFonts w:ascii="Times New Roman" w:hAnsi="Times New Roman" w:cs="Times New Roman"/>
+          <w:lang w:val="pt-BR"/>
+        </w:rPr>
+        <w:t xml:space="preserve"> utilizado.</w:t>
+      </w:r>
+    </w:p>
+    <w:p>
+      <w:pPr>
+        <w:spacing w:after="0" w:line="360" w:lineRule="auto"/>
+        <w:ind w:firstLine="720"/>
+        <w:jc w:val="both"/>
+        <w:rPr>
+          <w:rFonts w:ascii="Times New Roman" w:hAnsi="Times New Roman" w:cs="Times New Roman"/>
+          <w:lang w:val="pt-BR"/>
+        </w:rPr>
+      </w:pPr>
+      <w:r>
+        <w:rPr>
+          <w:rFonts w:ascii="Times New Roman" w:hAnsi="Times New Roman" w:cs="Times New Roman"/>
+          <w:lang w:val="pt-BR"/>
+        </w:rPr>
+        <w:t xml:space="preserve">Diante desses resultados, a questão de pesquisa pode ser respondida indicando que, nas condições experimentais avaliadas, as duas plataformas apresentaram comportamentos diferentes diante do aumento do volume de dados. O </w:t>
+      </w:r>
+      <w:proofErr w:type="spellStart"/>
+      <w:r>
+        <w:rPr>
+          <w:rFonts w:ascii="Times New Roman" w:hAnsi="Times New Roman" w:cs="Times New Roman"/>
+          <w:lang w:val="pt-BR"/>
+        </w:rPr>
+        <w:t>Pentaho</w:t>
+      </w:r>
+      <w:proofErr w:type="spellEnd"/>
+      <w:r>
+        <w:rPr>
+          <w:rFonts w:ascii="Times New Roman" w:hAnsi="Times New Roman" w:cs="Times New Roman"/>
+          <w:lang w:val="pt-BR"/>
+        </w:rPr>
+        <w:t xml:space="preserve"> apresentou menor tempo de execução no menor cenário, enquanto o </w:t>
+      </w:r>
+      <w:proofErr w:type="spellStart"/>
+      <w:r>
+        <w:rPr>
+          <w:rFonts w:ascii="Times New Roman" w:hAnsi="Times New Roman" w:cs="Times New Roman"/>
+          <w:lang w:val="pt-BR"/>
+        </w:rPr>
+        <w:t>Databricks</w:t>
+      </w:r>
+      <w:proofErr w:type="spellEnd"/>
+      <w:r>
+        <w:rPr>
+          <w:rFonts w:ascii="Times New Roman" w:hAnsi="Times New Roman" w:cs="Times New Roman"/>
+          <w:lang w:val="pt-BR"/>
+        </w:rPr>
+        <w:t xml:space="preserve"> manteve crescimento proporcionalmente mais moderado à medida que a quantidade de dados aumentou. Dessa forma, os resultados obtidos são compatíveis com a hipótese estabelecida de maior escalabilidade do </w:t>
+      </w:r>
+      <w:proofErr w:type="spellStart"/>
+      <w:r>
+        <w:rPr>
+          <w:rFonts w:ascii="Times New Roman" w:hAnsi="Times New Roman" w:cs="Times New Roman"/>
+          <w:lang w:val="pt-BR"/>
+        </w:rPr>
+        <w:t>Databricks</w:t>
+      </w:r>
+      <w:proofErr w:type="spellEnd"/>
+      <w:r>
+        <w:rPr>
+          <w:rFonts w:ascii="Times New Roman" w:hAnsi="Times New Roman" w:cs="Times New Roman"/>
+          <w:lang w:val="pt-BR"/>
+        </w:rPr>
+        <w:t xml:space="preserve"> no contexto avaliado.</w:t>
+      </w:r>
+    </w:p>
+    <w:p>
+      <w:pPr>
+        <w:spacing w:after="0" w:line="360" w:lineRule="auto"/>
+        <w:ind w:firstLine="720"/>
+        <w:jc w:val="both"/>
+        <w:rPr>
+          <w:rFonts w:ascii="Times New Roman" w:hAnsi="Times New Roman" w:cs="Times New Roman"/>
+          <w:lang w:val="pt-BR"/>
+        </w:rPr>
+      </w:pPr>
+      <w:r>
+        <w:rPr>
+          <w:rFonts w:ascii="Times New Roman" w:hAnsi="Times New Roman" w:cs="Times New Roman"/>
+          <w:lang w:val="pt-BR"/>
+        </w:rPr>
+        <w:t xml:space="preserve">Essa conclusão, entretanto, não deve ser interpretada como evidência de superioridade universal de uma plataforma sobre a outra. O </w:t>
+      </w:r>
+      <w:proofErr w:type="spellStart"/>
+      <w:r>
+        <w:rPr>
+          <w:rFonts w:ascii="Times New Roman" w:hAnsi="Times New Roman" w:cs="Times New Roman"/>
+          <w:lang w:val="pt-BR"/>
+        </w:rPr>
+        <w:t>Pentaho</w:t>
+      </w:r>
+      <w:proofErr w:type="spellEnd"/>
+      <w:r>
+        <w:rPr>
+          <w:rFonts w:ascii="Times New Roman" w:hAnsi="Times New Roman" w:cs="Times New Roman"/>
+          <w:lang w:val="pt-BR"/>
+        </w:rPr>
+        <w:t xml:space="preserve"> foi executado em hardware local com recursos fixos e utilizou arquivos CSV para persistência, enquanto o </w:t>
+      </w:r>
+      <w:proofErr w:type="spellStart"/>
+      <w:r>
+        <w:rPr>
+          <w:rFonts w:ascii="Times New Roman" w:hAnsi="Times New Roman" w:cs="Times New Roman"/>
+          <w:lang w:val="pt-BR"/>
+        </w:rPr>
+        <w:t>Databricks</w:t>
+      </w:r>
+      <w:proofErr w:type="spellEnd"/>
+      <w:r>
+        <w:rPr>
+          <w:rFonts w:ascii="Times New Roman" w:hAnsi="Times New Roman" w:cs="Times New Roman"/>
+          <w:lang w:val="pt-BR"/>
+        </w:rPr>
+        <w:t xml:space="preserve"> foi executado em ambiente </w:t>
+      </w:r>
+      <w:proofErr w:type="spellStart"/>
+      <w:r>
+        <w:rPr>
+          <w:rFonts w:ascii="Times New Roman" w:hAnsi="Times New Roman" w:cs="Times New Roman"/>
+          <w:lang w:val="pt-BR"/>
+        </w:rPr>
+        <w:t>Serverless</w:t>
+      </w:r>
+      <w:proofErr w:type="spellEnd"/>
+      <w:r>
+        <w:rPr>
+          <w:rFonts w:ascii="Times New Roman" w:hAnsi="Times New Roman" w:cs="Times New Roman"/>
+          <w:lang w:val="pt-BR"/>
+        </w:rPr>
+        <w:t xml:space="preserve"> gerenciado e utilizou tabelas Delta. Os recursos computacionais internos utilizados pelo </w:t>
+      </w:r>
+      <w:proofErr w:type="spellStart"/>
+      <w:r>
+        <w:rPr>
+          <w:rFonts w:ascii="Times New Roman" w:hAnsi="Times New Roman" w:cs="Times New Roman"/>
+          <w:lang w:val="pt-BR"/>
+        </w:rPr>
+        <w:t>Databricks</w:t>
+      </w:r>
+      <w:proofErr w:type="spellEnd"/>
+      <w:r>
+        <w:rPr>
+          <w:rFonts w:ascii="Times New Roman" w:hAnsi="Times New Roman" w:cs="Times New Roman"/>
+          <w:lang w:val="pt-BR"/>
+        </w:rPr>
+        <w:t xml:space="preserve"> não foram controlados como uma configuração fixa durante o experimento. Essas diferenças constituem limitações importantes e fazem com que os resultados representem especificamente os ambientes e as implementações avaliados.</w:t>
+      </w:r>
+    </w:p>
+    <w:p>
+      <w:pPr>
+        <w:spacing w:after="0" w:line="360" w:lineRule="auto"/>
+        <w:ind w:firstLine="720"/>
+        <w:jc w:val="both"/>
+        <w:rPr>
+          <w:rFonts w:ascii="Times New Roman" w:hAnsi="Times New Roman" w:cs="Times New Roman"/>
+          <w:lang w:val="pt-BR"/>
+        </w:rPr>
+      </w:pPr>
+      <w:r>
+        <w:rPr>
+          <w:rFonts w:ascii="Times New Roman" w:hAnsi="Times New Roman" w:cs="Times New Roman"/>
+          <w:lang w:val="pt-BR"/>
+        </w:rPr>
+        <w:t>Como trabalhos futuros, recomenda-se repetir o experimento utilizando infraestruturas mais próximas em capacidade computacional, avaliar volumes superiores a 5 milhões de transações, ampliar o número de repetições e investigar outros tipos de transformação e formatos de armazenamento. Também podem ser incorporadas métricas adicionais, como utilização de CPU, consumo de memória, recursos computacionais empregados e custo de processamento. Essas extensões podem contribuir para uma compreensão mais ampla das condições em que diferentes abordagens e plataformas de engenharia de dados apresentam vantagens.</w:t>
+      </w:r>
+    </w:p>
+    <w:p>
+      <w:pPr>
+        <w:spacing w:after="0" w:line="360" w:lineRule="auto"/>
+        <w:jc w:val="both"/>
+        <w:rPr>
+          <w:rFonts w:ascii="Times New Roman" w:hAnsi="Times New Roman" w:cs="Times New Roman"/>
+          <w:lang w:val="pt-BR"/>
+        </w:rPr>
+      </w:pPr>
+    </w:p>
+    <w:p>
+      <w:pPr>
+        <w:spacing w:after="0" w:line="360" w:lineRule="auto"/>
+        <w:jc w:val="both"/>
         <w:rPr>
           <w:rFonts w:ascii="Times New Roman" w:hAnsi="Times New Roman" w:cs="Times New Roman"/>
           <w:b/>
           <w:bCs/>
           <w:lang w:val="pt-BR"/>
         </w:rPr>
-        <w:t>CONCLUSÃO</w:t>
-      </w:r>
-    </w:p>
-    <w:p>
-      <w:pPr>
-        <w:spacing w:after="0" w:line="360" w:lineRule="auto"/>
-        <w:jc w:val="both"/>
-        <w:rPr>
-          <w:rFonts w:ascii="Times New Roman" w:hAnsi="Times New Roman" w:cs="Times New Roman"/>
-          <w:lang w:val="pt-BR"/>
-        </w:rPr>
-      </w:pPr>
-    </w:p>
-    <w:p>
-      <w:pPr>
-        <w:spacing w:after="0" w:line="360" w:lineRule="auto"/>
-        <w:ind w:firstLine="720"/>
-        <w:jc w:val="both"/>
-        <w:rPr>
-          <w:rFonts w:ascii="Times New Roman" w:hAnsi="Times New Roman" w:cs="Times New Roman"/>
-          <w:lang w:val="pt-BR"/>
-        </w:rPr>
-      </w:pPr>
-      <w:r>
-        <w:rPr>
-          <w:rFonts w:ascii="Times New Roman" w:hAnsi="Times New Roman" w:cs="Times New Roman"/>
-          <w:lang w:val="pt-BR"/>
-        </w:rPr>
-        <w:t xml:space="preserve">Este estudo teve como objetivo comparar o desempenho do </w:t>
-      </w:r>
-      <w:proofErr w:type="spellStart"/>
-      <w:r>
-        <w:rPr>
-          <w:rFonts w:ascii="Times New Roman" w:hAnsi="Times New Roman" w:cs="Times New Roman"/>
-          <w:lang w:val="pt-BR"/>
-        </w:rPr>
-        <w:t>Pentaho</w:t>
-      </w:r>
-      <w:proofErr w:type="spellEnd"/>
-      <w:r>
-        <w:rPr>
-          <w:rFonts w:ascii="Times New Roman" w:hAnsi="Times New Roman" w:cs="Times New Roman"/>
-          <w:lang w:val="pt-BR"/>
-        </w:rPr>
-        <w:t xml:space="preserve"> Data </w:t>
-      </w:r>
-      <w:proofErr w:type="spellStart"/>
-      <w:r>
-        <w:rPr>
-          <w:rFonts w:ascii="Times New Roman" w:hAnsi="Times New Roman" w:cs="Times New Roman"/>
-          <w:lang w:val="pt-BR"/>
-        </w:rPr>
-        <w:t>Integration</w:t>
-      </w:r>
-      <w:proofErr w:type="spellEnd"/>
-      <w:r>
-        <w:rPr>
-          <w:rFonts w:ascii="Times New Roman" w:hAnsi="Times New Roman" w:cs="Times New Roman"/>
-          <w:lang w:val="pt-BR"/>
-        </w:rPr>
-        <w:t xml:space="preserve"> e do </w:t>
-      </w:r>
-      <w:proofErr w:type="spellStart"/>
-      <w:r>
-        <w:rPr>
-          <w:rFonts w:ascii="Times New Roman" w:hAnsi="Times New Roman" w:cs="Times New Roman"/>
-          <w:lang w:val="pt-BR"/>
-        </w:rPr>
-        <w:t>Databricks</w:t>
-      </w:r>
-      <w:proofErr w:type="spellEnd"/>
-      <w:r>
-        <w:rPr>
-          <w:rFonts w:ascii="Times New Roman" w:hAnsi="Times New Roman" w:cs="Times New Roman"/>
-          <w:lang w:val="pt-BR"/>
-        </w:rPr>
-        <w:t xml:space="preserve"> na execução de processos ETL submetidos a diferentes volumes de dados. Para isso, foram implementados processos logicamente equivalentes nas duas plataformas, utilizando os mesmos conjuntos de dados sintéticos e as mesmas regras principais de transformação. A utilização de dados determinísticos, validações de consistência, execução de aquecimento e três repetições medidas por cenário permitiu estruturar uma comparação reproduzível dentro das condições experimentais adotadas.</w:t>
-      </w:r>
-    </w:p>
-    <w:p>
-      <w:pPr>
-        <w:spacing w:after="0" w:line="360" w:lineRule="auto"/>
-        <w:ind w:firstLine="720"/>
-        <w:jc w:val="both"/>
-        <w:rPr>
-          <w:rFonts w:ascii="Times New Roman" w:hAnsi="Times New Roman" w:cs="Times New Roman"/>
-          <w:lang w:val="pt-BR"/>
-        </w:rPr>
-      </w:pPr>
-      <w:r>
-        <w:rPr>
-          <w:rFonts w:ascii="Times New Roman" w:hAnsi="Times New Roman" w:cs="Times New Roman"/>
-          <w:lang w:val="pt-BR"/>
-        </w:rPr>
-        <w:lastRenderedPageBreak/>
-        <w:t xml:space="preserve">Os resultados demonstraram comportamentos distintos conforme o volume processado aumentou. No cenário de 100 mil transações, o </w:t>
-      </w:r>
-      <w:proofErr w:type="spellStart"/>
-      <w:r>
-        <w:rPr>
-          <w:rFonts w:ascii="Times New Roman" w:hAnsi="Times New Roman" w:cs="Times New Roman"/>
-          <w:lang w:val="pt-BR"/>
-        </w:rPr>
-        <w:t>Pentaho</w:t>
-      </w:r>
-      <w:proofErr w:type="spellEnd"/>
-      <w:r>
-        <w:rPr>
-          <w:rFonts w:ascii="Times New Roman" w:hAnsi="Times New Roman" w:cs="Times New Roman"/>
-          <w:lang w:val="pt-BR"/>
-        </w:rPr>
-        <w:t xml:space="preserve"> apresentou menor tempo médio </w:t>
-      </w:r>
-      <w:proofErr w:type="spellStart"/>
-      <w:r>
-        <w:rPr>
-          <w:rFonts w:ascii="Times New Roman" w:hAnsi="Times New Roman" w:cs="Times New Roman"/>
-          <w:lang w:val="pt-BR"/>
-        </w:rPr>
-        <w:t>end-to-end</w:t>
-      </w:r>
-      <w:proofErr w:type="spellEnd"/>
-      <w:r>
-        <w:rPr>
-          <w:rFonts w:ascii="Times New Roman" w:hAnsi="Times New Roman" w:cs="Times New Roman"/>
-          <w:lang w:val="pt-BR"/>
-        </w:rPr>
-        <w:t xml:space="preserve">, com 3,667 segundos, contra 4,793 segundos do </w:t>
-      </w:r>
-      <w:proofErr w:type="spellStart"/>
-      <w:r>
-        <w:rPr>
-          <w:rFonts w:ascii="Times New Roman" w:hAnsi="Times New Roman" w:cs="Times New Roman"/>
-          <w:lang w:val="pt-BR"/>
-        </w:rPr>
-        <w:t>Databricks</w:t>
-      </w:r>
-      <w:proofErr w:type="spellEnd"/>
-      <w:r>
-        <w:rPr>
-          <w:rFonts w:ascii="Times New Roman" w:hAnsi="Times New Roman" w:cs="Times New Roman"/>
-          <w:lang w:val="pt-BR"/>
-        </w:rPr>
-        <w:t xml:space="preserve">. Entretanto, essa relação se inverteu a partir do cenário de 500 mil transações e as diferenças aumentaram nos volumes seguintes. No cenário de 5 milhões de transações, o </w:t>
-      </w:r>
-      <w:proofErr w:type="spellStart"/>
-      <w:r>
-        <w:rPr>
-          <w:rFonts w:ascii="Times New Roman" w:hAnsi="Times New Roman" w:cs="Times New Roman"/>
-          <w:lang w:val="pt-BR"/>
-        </w:rPr>
-        <w:t>Databricks</w:t>
-      </w:r>
-      <w:proofErr w:type="spellEnd"/>
-      <w:r>
-        <w:rPr>
-          <w:rFonts w:ascii="Times New Roman" w:hAnsi="Times New Roman" w:cs="Times New Roman"/>
-          <w:lang w:val="pt-BR"/>
-        </w:rPr>
-        <w:t xml:space="preserve"> registrou tempo médio </w:t>
-      </w:r>
-      <w:proofErr w:type="spellStart"/>
-      <w:r>
-        <w:rPr>
-          <w:rFonts w:ascii="Times New Roman" w:hAnsi="Times New Roman" w:cs="Times New Roman"/>
-          <w:lang w:val="pt-BR"/>
-        </w:rPr>
-        <w:t>end-to-end</w:t>
-      </w:r>
-      <w:proofErr w:type="spellEnd"/>
-      <w:r>
-        <w:rPr>
-          <w:rFonts w:ascii="Times New Roman" w:hAnsi="Times New Roman" w:cs="Times New Roman"/>
-          <w:lang w:val="pt-BR"/>
-        </w:rPr>
-        <w:t xml:space="preserve"> de 8,695 segundos, enquanto o </w:t>
-      </w:r>
-      <w:proofErr w:type="spellStart"/>
-      <w:r>
-        <w:rPr>
-          <w:rFonts w:ascii="Times New Roman" w:hAnsi="Times New Roman" w:cs="Times New Roman"/>
-          <w:lang w:val="pt-BR"/>
-        </w:rPr>
-        <w:t>Pentaho</w:t>
-      </w:r>
-      <w:proofErr w:type="spellEnd"/>
-      <w:r>
-        <w:rPr>
-          <w:rFonts w:ascii="Times New Roman" w:hAnsi="Times New Roman" w:cs="Times New Roman"/>
-          <w:lang w:val="pt-BR"/>
-        </w:rPr>
-        <w:t xml:space="preserve"> registrou 174,333 segundos.</w:t>
-      </w:r>
-    </w:p>
-    <w:p>
-      <w:pPr>
-        <w:spacing w:after="0" w:line="360" w:lineRule="auto"/>
-        <w:ind w:firstLine="720"/>
-        <w:jc w:val="both"/>
-        <w:rPr>
-          <w:rFonts w:ascii="Times New Roman" w:hAnsi="Times New Roman" w:cs="Times New Roman"/>
-          <w:lang w:val="pt-BR"/>
-        </w:rPr>
-      </w:pPr>
-      <w:r>
-        <w:rPr>
-          <w:rFonts w:ascii="Times New Roman" w:hAnsi="Times New Roman" w:cs="Times New Roman"/>
-          <w:lang w:val="pt-BR"/>
-        </w:rPr>
-        <w:t xml:space="preserve">Entre o menor e o maior cenário, o volume de transações aumentou 50 vezes. Nesse intervalo, o tempo médio </w:t>
-      </w:r>
-      <w:proofErr w:type="spellStart"/>
-      <w:r>
-        <w:rPr>
-          <w:rFonts w:ascii="Times New Roman" w:hAnsi="Times New Roman" w:cs="Times New Roman"/>
-          <w:lang w:val="pt-BR"/>
-        </w:rPr>
-        <w:t>end-to-end</w:t>
-      </w:r>
-      <w:proofErr w:type="spellEnd"/>
-      <w:r>
-        <w:rPr>
-          <w:rFonts w:ascii="Times New Roman" w:hAnsi="Times New Roman" w:cs="Times New Roman"/>
-          <w:lang w:val="pt-BR"/>
-        </w:rPr>
-        <w:t xml:space="preserve"> do </w:t>
-      </w:r>
-      <w:proofErr w:type="spellStart"/>
-      <w:r>
-        <w:rPr>
-          <w:rFonts w:ascii="Times New Roman" w:hAnsi="Times New Roman" w:cs="Times New Roman"/>
-          <w:lang w:val="pt-BR"/>
-        </w:rPr>
-        <w:t>Databricks</w:t>
-      </w:r>
-      <w:proofErr w:type="spellEnd"/>
-      <w:r>
-        <w:rPr>
-          <w:rFonts w:ascii="Times New Roman" w:hAnsi="Times New Roman" w:cs="Times New Roman"/>
-          <w:lang w:val="pt-BR"/>
-        </w:rPr>
-        <w:t xml:space="preserve"> aumentou aproximadamente 81,4%, passando de 4,793 para 8,695 segundos. No </w:t>
-      </w:r>
-      <w:proofErr w:type="spellStart"/>
-      <w:r>
-        <w:rPr>
-          <w:rFonts w:ascii="Times New Roman" w:hAnsi="Times New Roman" w:cs="Times New Roman"/>
-          <w:lang w:val="pt-BR"/>
-        </w:rPr>
-        <w:t>Pentaho</w:t>
-      </w:r>
-      <w:proofErr w:type="spellEnd"/>
-      <w:r>
-        <w:rPr>
-          <w:rFonts w:ascii="Times New Roman" w:hAnsi="Times New Roman" w:cs="Times New Roman"/>
-          <w:lang w:val="pt-BR"/>
-        </w:rPr>
-        <w:t xml:space="preserve">, o tempo do maior cenário correspondeu a aproximadamente 47,5 vezes o tempo observado no menor. A análise das etapas mostrou ainda que o crescimento do tempo no </w:t>
-      </w:r>
-      <w:proofErr w:type="spellStart"/>
-      <w:r>
-        <w:rPr>
-          <w:rFonts w:ascii="Times New Roman" w:hAnsi="Times New Roman" w:cs="Times New Roman"/>
-          <w:lang w:val="pt-BR"/>
-        </w:rPr>
-        <w:t>Pentaho</w:t>
-      </w:r>
-      <w:proofErr w:type="spellEnd"/>
-      <w:r>
-        <w:rPr>
-          <w:rFonts w:ascii="Times New Roman" w:hAnsi="Times New Roman" w:cs="Times New Roman"/>
-          <w:lang w:val="pt-BR"/>
-        </w:rPr>
-        <w:t xml:space="preserve"> foi especialmente acentuado na etapa Silver-</w:t>
-      </w:r>
-      <w:proofErr w:type="spellStart"/>
-      <w:r>
-        <w:rPr>
-          <w:rFonts w:ascii="Times New Roman" w:hAnsi="Times New Roman" w:cs="Times New Roman"/>
-          <w:lang w:val="pt-BR"/>
-        </w:rPr>
-        <w:t>to</w:t>
-      </w:r>
-      <w:proofErr w:type="spellEnd"/>
-      <w:r>
-        <w:rPr>
-          <w:rFonts w:ascii="Times New Roman" w:hAnsi="Times New Roman" w:cs="Times New Roman"/>
-          <w:lang w:val="pt-BR"/>
-        </w:rPr>
-        <w:t xml:space="preserve">-Gold, enquanto essa etapa permaneceu próxima de dois segundos no ambiente </w:t>
-      </w:r>
-      <w:proofErr w:type="spellStart"/>
-      <w:r>
-        <w:rPr>
-          <w:rFonts w:ascii="Times New Roman" w:hAnsi="Times New Roman" w:cs="Times New Roman"/>
-          <w:lang w:val="pt-BR"/>
-        </w:rPr>
-        <w:t>Databricks</w:t>
-      </w:r>
-      <w:proofErr w:type="spellEnd"/>
-      <w:r>
-        <w:rPr>
-          <w:rFonts w:ascii="Times New Roman" w:hAnsi="Times New Roman" w:cs="Times New Roman"/>
-          <w:lang w:val="pt-BR"/>
-        </w:rPr>
-        <w:t xml:space="preserve"> utilizado.</w:t>
-      </w:r>
-    </w:p>
-    <w:p>
-      <w:pPr>
-        <w:spacing w:after="0" w:line="360" w:lineRule="auto"/>
-        <w:ind w:firstLine="720"/>
-        <w:jc w:val="both"/>
-        <w:rPr>
-          <w:rFonts w:ascii="Times New Roman" w:hAnsi="Times New Roman" w:cs="Times New Roman"/>
-          <w:lang w:val="pt-BR"/>
-        </w:rPr>
-      </w:pPr>
-      <w:r>
-        <w:rPr>
-          <w:rFonts w:ascii="Times New Roman" w:hAnsi="Times New Roman" w:cs="Times New Roman"/>
-          <w:lang w:val="pt-BR"/>
-        </w:rPr>
-        <w:t xml:space="preserve">Diante desses resultados, a questão de pesquisa pode ser respondida indicando que, nas condições experimentais avaliadas, as duas plataformas apresentaram comportamentos diferentes diante do aumento do volume de dados. O </w:t>
-      </w:r>
-      <w:proofErr w:type="spellStart"/>
-      <w:r>
-        <w:rPr>
-          <w:rFonts w:ascii="Times New Roman" w:hAnsi="Times New Roman" w:cs="Times New Roman"/>
-          <w:lang w:val="pt-BR"/>
-        </w:rPr>
-        <w:t>Pentaho</w:t>
-      </w:r>
-      <w:proofErr w:type="spellEnd"/>
-      <w:r>
-        <w:rPr>
-          <w:rFonts w:ascii="Times New Roman" w:hAnsi="Times New Roman" w:cs="Times New Roman"/>
-          <w:lang w:val="pt-BR"/>
-        </w:rPr>
-        <w:t xml:space="preserve"> apresentou menor tempo de execução no menor cenário, enquanto o </w:t>
-      </w:r>
-      <w:proofErr w:type="spellStart"/>
-      <w:r>
-        <w:rPr>
-          <w:rFonts w:ascii="Times New Roman" w:hAnsi="Times New Roman" w:cs="Times New Roman"/>
-          <w:lang w:val="pt-BR"/>
-        </w:rPr>
-        <w:t>Databricks</w:t>
-      </w:r>
-      <w:proofErr w:type="spellEnd"/>
-      <w:r>
-        <w:rPr>
-          <w:rFonts w:ascii="Times New Roman" w:hAnsi="Times New Roman" w:cs="Times New Roman"/>
-          <w:lang w:val="pt-BR"/>
-        </w:rPr>
-        <w:t xml:space="preserve"> manteve crescimento proporcionalmente mais moderado à medida que a quantidade de dados aumentou. Dessa forma, os resultados obtidos são compatíveis com a hipótese estabelecida de maior escalabilidade do </w:t>
-      </w:r>
-      <w:proofErr w:type="spellStart"/>
-      <w:r>
-        <w:rPr>
-          <w:rFonts w:ascii="Times New Roman" w:hAnsi="Times New Roman" w:cs="Times New Roman"/>
-          <w:lang w:val="pt-BR"/>
-        </w:rPr>
-        <w:t>Databricks</w:t>
-      </w:r>
-      <w:proofErr w:type="spellEnd"/>
-      <w:r>
-        <w:rPr>
-          <w:rFonts w:ascii="Times New Roman" w:hAnsi="Times New Roman" w:cs="Times New Roman"/>
-          <w:lang w:val="pt-BR"/>
-        </w:rPr>
-        <w:t xml:space="preserve"> no contexto avaliado.</w:t>
-      </w:r>
-    </w:p>
-    <w:p>
-      <w:pPr>
-        <w:spacing w:after="0" w:line="360" w:lineRule="auto"/>
-        <w:ind w:firstLine="720"/>
-        <w:jc w:val="both"/>
-        <w:rPr>
-          <w:rFonts w:ascii="Times New Roman" w:hAnsi="Times New Roman" w:cs="Times New Roman"/>
-          <w:lang w:val="pt-BR"/>
-        </w:rPr>
-      </w:pPr>
-      <w:r>
-        <w:rPr>
-          <w:rFonts w:ascii="Times New Roman" w:hAnsi="Times New Roman" w:cs="Times New Roman"/>
-          <w:lang w:val="pt-BR"/>
-        </w:rPr>
-        <w:t xml:space="preserve">Essa conclusão, entretanto, não deve ser interpretada como evidência de superioridade universal de uma plataforma sobre a outra. O </w:t>
-      </w:r>
-      <w:proofErr w:type="spellStart"/>
-      <w:r>
-        <w:rPr>
-          <w:rFonts w:ascii="Times New Roman" w:hAnsi="Times New Roman" w:cs="Times New Roman"/>
-          <w:lang w:val="pt-BR"/>
-        </w:rPr>
-        <w:t>Pentaho</w:t>
-      </w:r>
-      <w:proofErr w:type="spellEnd"/>
-      <w:r>
-        <w:rPr>
-          <w:rFonts w:ascii="Times New Roman" w:hAnsi="Times New Roman" w:cs="Times New Roman"/>
-          <w:lang w:val="pt-BR"/>
-        </w:rPr>
-        <w:t xml:space="preserve"> foi executado em hardware local com recursos fixos e utilizou arquivos CSV para persistência, enquanto o </w:t>
-      </w:r>
-      <w:proofErr w:type="spellStart"/>
-      <w:r>
-        <w:rPr>
-          <w:rFonts w:ascii="Times New Roman" w:hAnsi="Times New Roman" w:cs="Times New Roman"/>
-          <w:lang w:val="pt-BR"/>
-        </w:rPr>
-        <w:t>Databricks</w:t>
-      </w:r>
-      <w:proofErr w:type="spellEnd"/>
-      <w:r>
-        <w:rPr>
-          <w:rFonts w:ascii="Times New Roman" w:hAnsi="Times New Roman" w:cs="Times New Roman"/>
-          <w:lang w:val="pt-BR"/>
-        </w:rPr>
-        <w:t xml:space="preserve"> foi executado em ambiente </w:t>
-      </w:r>
-      <w:proofErr w:type="spellStart"/>
-      <w:r>
-        <w:rPr>
-          <w:rFonts w:ascii="Times New Roman" w:hAnsi="Times New Roman" w:cs="Times New Roman"/>
-          <w:lang w:val="pt-BR"/>
-        </w:rPr>
-        <w:t>Serverless</w:t>
-      </w:r>
-      <w:proofErr w:type="spellEnd"/>
-      <w:r>
-        <w:rPr>
-          <w:rFonts w:ascii="Times New Roman" w:hAnsi="Times New Roman" w:cs="Times New Roman"/>
-          <w:lang w:val="pt-BR"/>
-        </w:rPr>
-        <w:t xml:space="preserve"> gerenciado e utilizou tabelas Delta. Os recursos computacionais internos utilizados pelo </w:t>
-      </w:r>
-      <w:proofErr w:type="spellStart"/>
-      <w:r>
-        <w:rPr>
-          <w:rFonts w:ascii="Times New Roman" w:hAnsi="Times New Roman" w:cs="Times New Roman"/>
-          <w:lang w:val="pt-BR"/>
-        </w:rPr>
-        <w:t>Databricks</w:t>
-      </w:r>
-      <w:proofErr w:type="spellEnd"/>
-      <w:r>
-        <w:rPr>
-          <w:rFonts w:ascii="Times New Roman" w:hAnsi="Times New Roman" w:cs="Times New Roman"/>
-          <w:lang w:val="pt-BR"/>
-        </w:rPr>
-        <w:t xml:space="preserve"> não foram controlados como uma configuração fixa durante o experimento. Essas diferenças constituem limitações importantes e fazem com que os resultados representem especificamente os ambientes e as implementações avaliados.</w:t>
-      </w:r>
-    </w:p>
-    <w:p>
-      <w:pPr>
-        <w:spacing w:after="0" w:line="360" w:lineRule="auto"/>
-        <w:ind w:firstLine="720"/>
-        <w:jc w:val="both"/>
-        <w:rPr>
-          <w:rFonts w:ascii="Times New Roman" w:hAnsi="Times New Roman" w:cs="Times New Roman"/>
-          <w:lang w:val="pt-BR"/>
-        </w:rPr>
-      </w:pPr>
-      <w:r>
-        <w:rPr>
-          <w:rFonts w:ascii="Times New Roman" w:hAnsi="Times New Roman" w:cs="Times New Roman"/>
-          <w:lang w:val="pt-BR"/>
-        </w:rPr>
-        <w:t xml:space="preserve">Como trabalhos futuros, recomenda-se repetir o experimento utilizando infraestruturas mais próximas em capacidade computacional, avaliar volumes superiores a 5 milhões de transações, ampliar o número de repetições e investigar outros tipos de transformação e formatos de armazenamento. Também podem ser incorporadas métricas adicionais, como utilização de CPU, consumo de memória, recursos computacionais empregados e custo de processamento. Essas </w:t>
-      </w:r>
-      <w:r>
-        <w:rPr>
-          <w:rFonts w:ascii="Times New Roman" w:hAnsi="Times New Roman" w:cs="Times New Roman"/>
-          <w:lang w:val="pt-BR"/>
-        </w:rPr>
-        <w:lastRenderedPageBreak/>
-        <w:t>extensões podem contribuir para uma compreensão mais ampla das condições em que diferentes abordagens e plataformas de engenharia de dados apresentam vantagens.</w:t>
-      </w:r>
-    </w:p>
-    <w:p>
-      <w:pPr>
-        <w:spacing w:after="0" w:line="360" w:lineRule="auto"/>
-        <w:jc w:val="both"/>
-        <w:rPr>
-          <w:rFonts w:ascii="Times New Roman" w:hAnsi="Times New Roman" w:cs="Times New Roman"/>
-          <w:lang w:val="pt-BR"/>
-        </w:rPr>
       </w:pPr>
     </w:p>
     <w:p>
@@ -13636,54 +13679,57 @@
           <w:lang w:val="pt-BR"/>
         </w:rPr>
       </w:pPr>
-      <w:r>
+    </w:p>
+    <w:p>
+      <w:pPr>
+        <w:spacing w:after="0" w:line="360" w:lineRule="auto"/>
+        <w:jc w:val="center"/>
         <w:rPr>
           <w:rFonts w:ascii="Times New Roman" w:hAnsi="Times New Roman" w:cs="Times New Roman"/>
           <w:b/>
           <w:bCs/>
           <w:lang w:val="pt-BR"/>
         </w:rPr>
-        <w:t>REFERÊNCIAS</w:t>
-      </w:r>
-    </w:p>
-    <w:p>
-      <w:pPr>
-        <w:spacing w:after="0" w:line="360" w:lineRule="auto"/>
-        <w:jc w:val="both"/>
+      </w:pPr>
+      <w:r>
         <w:rPr>
           <w:rFonts w:ascii="Times New Roman" w:hAnsi="Times New Roman" w:cs="Times New Roman"/>
           <w:b/>
           <w:bCs/>
           <w:lang w:val="pt-BR"/>
         </w:rPr>
-      </w:pPr>
-    </w:p>
-    <w:p>
-      <w:pPr>
-        <w:spacing w:after="0" w:line="240" w:lineRule="auto"/>
-        <w:jc w:val="both"/>
-        <w:rPr>
-          <w:rFonts w:ascii="Times New Roman" w:hAnsi="Times New Roman" w:cs="Times New Roman"/>
-          <w:lang w:val="pt-BR"/>
-        </w:rPr>
-      </w:pPr>
-      <w:r>
-        <w:rPr>
-          <w:rFonts w:ascii="Times New Roman" w:hAnsi="Times New Roman" w:cs="Times New Roman"/>
-          <w:lang w:val="pt-BR"/>
-        </w:rPr>
-        <w:t xml:space="preserve">ALVES, G. M. R.; FIDALGO, R. N. </w:t>
-      </w:r>
-      <w:r>
+        <w:lastRenderedPageBreak/>
+        <w:t>REFERÊNCIAS</w:t>
+      </w:r>
+    </w:p>
+    <w:p>
+      <w:pPr>
+        <w:spacing w:after="0" w:line="360" w:lineRule="auto"/>
+        <w:jc w:val="both"/>
         <w:rPr>
           <w:rFonts w:ascii="Times New Roman" w:hAnsi="Times New Roman" w:cs="Times New Roman"/>
           <w:b/>
           <w:bCs/>
           <w:lang w:val="pt-BR"/>
         </w:rPr>
-        <w:t xml:space="preserve">Um ambiente de Data </w:t>
-      </w:r>
-      <w:proofErr w:type="spellStart"/>
+      </w:pPr>
+    </w:p>
+    <w:p>
+      <w:pPr>
+        <w:spacing w:after="0" w:line="240" w:lineRule="auto"/>
+        <w:jc w:val="both"/>
+        <w:rPr>
+          <w:rFonts w:ascii="Times New Roman" w:hAnsi="Times New Roman" w:cs="Times New Roman"/>
+          <w:lang w:val="pt-BR"/>
+        </w:rPr>
+      </w:pPr>
+      <w:r>
+        <w:rPr>
+          <w:rFonts w:ascii="Times New Roman" w:hAnsi="Times New Roman" w:cs="Times New Roman"/>
+          <w:lang w:val="pt-BR"/>
+        </w:rPr>
+        <w:t xml:space="preserve">ALVES, G. M. R.; FIDALGO, R. N. </w:t>
+      </w:r>
       <w:r>
         <w:rPr>
           <w:rFonts w:ascii="Times New Roman" w:hAnsi="Times New Roman" w:cs="Times New Roman"/>
@@ -13691,9 +13737,9 @@
           <w:bCs/>
           <w:lang w:val="pt-BR"/>
         </w:rPr>
-        <w:t>Warehousing</w:t>
-      </w:r>
-      <w:proofErr w:type="spellEnd"/>
+        <w:t xml:space="preserve">Um ambiente de Data </w:t>
+      </w:r>
+      <w:proofErr w:type="spellStart"/>
       <w:r>
         <w:rPr>
           <w:rFonts w:ascii="Times New Roman" w:hAnsi="Times New Roman" w:cs="Times New Roman"/>
@@ -13701,6 +13747,16 @@
           <w:bCs/>
           <w:lang w:val="pt-BR"/>
         </w:rPr>
+        <w:t>Warehousing</w:t>
+      </w:r>
+      <w:proofErr w:type="spellEnd"/>
+      <w:r>
+        <w:rPr>
+          <w:rFonts w:ascii="Times New Roman" w:hAnsi="Times New Roman" w:cs="Times New Roman"/>
+          <w:b/>
+          <w:bCs/>
+          <w:lang w:val="pt-BR"/>
+        </w:rPr>
         <w:t xml:space="preserve"> para apoiar a tomada de decisão quanto à evasão escolar na UFPE</w:t>
       </w:r>
       <w:r>
@@ -13708,189 +13764,39 @@
           <w:rFonts w:ascii="Times New Roman" w:hAnsi="Times New Roman" w:cs="Times New Roman"/>
           <w:lang w:val="pt-BR"/>
         </w:rPr>
-        <w:t xml:space="preserve">. Recife: Universidade Federal de Pernambuco, 2020. Disponível em: </w:t>
-      </w:r>
-      <w:hyperlink r:id="rId16" w:tgtFrame="_blank" w:history="1">
+        <w:t>. Recife: Universidade Federal de Pernambuco, 2020. Disponível em:</w:t>
+      </w:r>
+      <w:r>
+        <w:rPr>
+          <w:rFonts w:ascii="Times New Roman" w:hAnsi="Times New Roman" w:cs="Times New Roman"/>
+          <w:lang w:val="pt-BR"/>
+        </w:rPr>
+        <w:t xml:space="preserve"> </w:t>
+      </w:r>
+      <w:hyperlink r:id="rId16" w:history="1">
         <w:r>
           <w:rPr>
             <w:rStyle w:val="Hyperlink"/>
             <w:rFonts w:ascii="Times New Roman" w:hAnsi="Times New Roman" w:cs="Times New Roman"/>
             <w:lang w:val="pt-BR"/>
           </w:rPr>
-          <w:t>Repositório do Centro de Informática da UFPE</w:t>
+          <w:t>https://sistemas2.uespi.br/bitstream/tede/2293/2/Monografia%2</w:t>
         </w:r>
-      </w:hyperlink>
-      <w:r>
-        <w:rPr>
-          <w:rFonts w:ascii="Times New Roman" w:hAnsi="Times New Roman" w:cs="Times New Roman"/>
-          <w:lang w:val="pt-BR"/>
-        </w:rPr>
-        <w:t xml:space="preserve">. Acesso em: 6 set. 2026. </w:t>
-      </w:r>
-    </w:p>
-    <w:p>
-      <w:pPr>
-        <w:spacing w:after="0" w:line="240" w:lineRule="auto"/>
-        <w:jc w:val="both"/>
-        <w:rPr>
-          <w:rFonts w:ascii="Times New Roman" w:hAnsi="Times New Roman" w:cs="Times New Roman"/>
-          <w:lang w:val="pt-BR"/>
-        </w:rPr>
-      </w:pPr>
-    </w:p>
-    <w:p>
-      <w:pPr>
-        <w:spacing w:after="0" w:line="240" w:lineRule="auto"/>
-        <w:jc w:val="both"/>
-        <w:rPr>
-          <w:rFonts w:ascii="Times New Roman" w:hAnsi="Times New Roman" w:cs="Times New Roman"/>
-          <w:lang w:val="pt-BR"/>
-        </w:rPr>
-      </w:pPr>
-      <w:r>
-        <w:rPr>
-          <w:rFonts w:ascii="Times New Roman" w:hAnsi="Times New Roman" w:cs="Times New Roman"/>
-          <w:lang w:val="pt-BR"/>
-        </w:rPr>
-        <w:t xml:space="preserve">DATABRICKS. </w:t>
-      </w:r>
-      <w:r>
-        <w:rPr>
-          <w:rFonts w:ascii="Times New Roman" w:hAnsi="Times New Roman" w:cs="Times New Roman"/>
-          <w:b/>
-          <w:bCs/>
-          <w:lang w:val="pt-BR"/>
-        </w:rPr>
-        <w:t xml:space="preserve">Apache Spark </w:t>
-      </w:r>
-      <w:proofErr w:type="spellStart"/>
-      <w:r>
-        <w:rPr>
-          <w:rFonts w:ascii="Times New Roman" w:hAnsi="Times New Roman" w:cs="Times New Roman"/>
-          <w:b/>
-          <w:bCs/>
-          <w:lang w:val="pt-BR"/>
-        </w:rPr>
-        <w:t>on</w:t>
-      </w:r>
-      <w:proofErr w:type="spellEnd"/>
-      <w:r>
-        <w:rPr>
-          <w:rFonts w:ascii="Times New Roman" w:hAnsi="Times New Roman" w:cs="Times New Roman"/>
-          <w:b/>
-          <w:bCs/>
-          <w:lang w:val="pt-BR"/>
-        </w:rPr>
-        <w:t xml:space="preserve"> </w:t>
-      </w:r>
-      <w:proofErr w:type="spellStart"/>
-      <w:r>
-        <w:rPr>
-          <w:rFonts w:ascii="Times New Roman" w:hAnsi="Times New Roman" w:cs="Times New Roman"/>
-          <w:b/>
-          <w:bCs/>
-          <w:lang w:val="pt-BR"/>
-        </w:rPr>
-        <w:t>Databricks</w:t>
-      </w:r>
-      <w:proofErr w:type="spellEnd"/>
-      <w:r>
-        <w:rPr>
-          <w:rFonts w:ascii="Times New Roman" w:hAnsi="Times New Roman" w:cs="Times New Roman"/>
-          <w:lang w:val="pt-BR"/>
-        </w:rPr>
-        <w:t xml:space="preserve">. 2026a. Disponível em: </w:t>
-      </w:r>
-      <w:hyperlink r:id="rId17" w:tgtFrame="_blank" w:history="1">
         <w:r>
           <w:rPr>
             <w:rStyle w:val="Hyperlink"/>
             <w:rFonts w:ascii="Times New Roman" w:hAnsi="Times New Roman" w:cs="Times New Roman"/>
             <w:lang w:val="pt-BR"/>
           </w:rPr>
-          <w:t>Documentação oficial</w:t>
+          <w:t>0</w:t>
         </w:r>
-      </w:hyperlink>
-      <w:r>
-        <w:rPr>
-          <w:rFonts w:ascii="Times New Roman" w:hAnsi="Times New Roman" w:cs="Times New Roman"/>
-          <w:lang w:val="pt-BR"/>
-        </w:rPr>
-        <w:t>. Acesso em: 6 set. 2026.</w:t>
-      </w:r>
-    </w:p>
-    <w:p>
-      <w:pPr>
-        <w:spacing w:after="0" w:line="240" w:lineRule="auto"/>
-        <w:jc w:val="both"/>
-        <w:rPr>
-          <w:rFonts w:ascii="Times New Roman" w:hAnsi="Times New Roman" w:cs="Times New Roman"/>
-          <w:lang w:val="pt-BR"/>
-        </w:rPr>
-      </w:pPr>
-    </w:p>
-    <w:p>
-      <w:pPr>
-        <w:spacing w:after="0" w:line="240" w:lineRule="auto"/>
-        <w:jc w:val="both"/>
-        <w:rPr>
-          <w:rFonts w:ascii="Times New Roman" w:hAnsi="Times New Roman" w:cs="Times New Roman"/>
-          <w:lang w:val="pt-BR"/>
-        </w:rPr>
-      </w:pPr>
-      <w:r>
-        <w:rPr>
-          <w:rFonts w:ascii="Times New Roman" w:hAnsi="Times New Roman" w:cs="Times New Roman"/>
-          <w:lang w:val="pt-BR"/>
-        </w:rPr>
-        <w:t xml:space="preserve">DATABRICKS. </w:t>
-      </w:r>
-      <w:proofErr w:type="spellStart"/>
-      <w:r>
-        <w:rPr>
-          <w:rFonts w:ascii="Times New Roman" w:hAnsi="Times New Roman" w:cs="Times New Roman"/>
-          <w:b/>
-          <w:bCs/>
-          <w:lang w:val="pt-BR"/>
-        </w:rPr>
-        <w:t>Databricks</w:t>
-      </w:r>
-      <w:proofErr w:type="spellEnd"/>
-      <w:r>
-        <w:rPr>
-          <w:rFonts w:ascii="Times New Roman" w:hAnsi="Times New Roman" w:cs="Times New Roman"/>
-          <w:b/>
-          <w:bCs/>
-          <w:lang w:val="pt-BR"/>
-        </w:rPr>
-        <w:t xml:space="preserve"> Free </w:t>
-      </w:r>
-      <w:proofErr w:type="spellStart"/>
-      <w:r>
-        <w:rPr>
-          <w:rFonts w:ascii="Times New Roman" w:hAnsi="Times New Roman" w:cs="Times New Roman"/>
-          <w:b/>
-          <w:bCs/>
-          <w:lang w:val="pt-BR"/>
-        </w:rPr>
-        <w:t>Edition</w:t>
-      </w:r>
-      <w:proofErr w:type="spellEnd"/>
-      <w:r>
-        <w:rPr>
-          <w:rFonts w:ascii="Times New Roman" w:hAnsi="Times New Roman" w:cs="Times New Roman"/>
-          <w:lang w:val="pt-BR"/>
-        </w:rPr>
-        <w:t xml:space="preserve">. 2026b. Disponível em: </w:t>
-      </w:r>
-      <w:hyperlink r:id="rId18" w:tgtFrame="_blank" w:history="1">
         <w:r>
           <w:rPr>
             <w:rStyle w:val="Hyperlink"/>
             <w:rFonts w:ascii="Times New Roman" w:hAnsi="Times New Roman" w:cs="Times New Roman"/>
             <w:lang w:val="pt-BR"/>
           </w:rPr>
-          <w:t>Documentação oficial</w:t>
+          <w:t>Completa.pdf</w:t>
         </w:r>
       </w:hyperlink>
       <w:r>
@@ -13898,7 +13804,7 @@
           <w:rFonts w:ascii="Times New Roman" w:hAnsi="Times New Roman" w:cs="Times New Roman"/>
           <w:lang w:val="pt-BR"/>
         </w:rPr>
-        <w:t>. Acesso em: 6 set. 2026.</w:t>
+        <w:t xml:space="preserve">. Acesso em: 6 set. 2026. </w:t>
       </w:r>
     </w:p>
     <w:p>
@@ -13917,6 +13823,7 @@
         <w:jc w:val="both"/>
         <w:rPr>
           <w:rFonts w:ascii="Times New Roman" w:hAnsi="Times New Roman" w:cs="Times New Roman"/>
+          <w:lang w:val="pt-BR"/>
         </w:rPr>
       </w:pPr>
       <w:r>
@@ -13926,7 +13833,6 @@
         </w:rPr>
         <w:t xml:space="preserve">DATABRICKS. </w:t>
       </w:r>
-      <w:proofErr w:type="spellStart"/>
       <w:r>
         <w:rPr>
           <w:rFonts w:ascii="Times New Roman" w:hAnsi="Times New Roman" w:cs="Times New Roman"/>
@@ -13934,9 +13840,9 @@
           <w:bCs/>
           <w:lang w:val="pt-BR"/>
         </w:rPr>
-        <w:t>Serverless</w:t>
-      </w:r>
-      <w:proofErr w:type="spellEnd"/>
+        <w:t xml:space="preserve">Apache Spark </w:t>
+      </w:r>
+      <w:proofErr w:type="spellStart"/>
       <w:r>
         <w:rPr>
           <w:rFonts w:ascii="Times New Roman" w:hAnsi="Times New Roman" w:cs="Times New Roman"/>
@@ -13944,23 +13850,57 @@
           <w:bCs/>
           <w:lang w:val="pt-BR"/>
         </w:rPr>
-        <w:t xml:space="preserve"> compute for notebooks</w:t>
-      </w:r>
-      <w:r>
-        <w:rPr>
-          <w:rFonts w:ascii="Times New Roman" w:hAnsi="Times New Roman" w:cs="Times New Roman"/>
-          <w:lang w:val="pt-BR"/>
-        </w:rPr>
-        <w:t xml:space="preserve">. 2026c. Disponível em: </w:t>
-      </w:r>
-      <w:hyperlink r:id="rId19" w:tgtFrame="_blank" w:history="1">
+        <w:t>on</w:t>
+      </w:r>
+      <w:proofErr w:type="spellEnd"/>
+      <w:r>
+        <w:rPr>
+          <w:rFonts w:ascii="Times New Roman" w:hAnsi="Times New Roman" w:cs="Times New Roman"/>
+          <w:b/>
+          <w:bCs/>
+          <w:lang w:val="pt-BR"/>
+        </w:rPr>
+        <w:t xml:space="preserve"> </w:t>
+      </w:r>
+      <w:proofErr w:type="spellStart"/>
+      <w:r>
+        <w:rPr>
+          <w:rFonts w:ascii="Times New Roman" w:hAnsi="Times New Roman" w:cs="Times New Roman"/>
+          <w:b/>
+          <w:bCs/>
+          <w:lang w:val="pt-BR"/>
+        </w:rPr>
+        <w:t>Databricks</w:t>
+      </w:r>
+      <w:proofErr w:type="spellEnd"/>
+      <w:r>
+        <w:rPr>
+          <w:rFonts w:ascii="Times New Roman" w:hAnsi="Times New Roman" w:cs="Times New Roman"/>
+          <w:lang w:val="pt-BR"/>
+        </w:rPr>
+        <w:t>. 2026a. Disponível em:</w:t>
+      </w:r>
+      <w:r>
+        <w:rPr>
+          <w:rFonts w:ascii="Times New Roman" w:hAnsi="Times New Roman" w:cs="Times New Roman"/>
+          <w:lang w:val="pt-BR"/>
+        </w:rPr>
+        <w:t xml:space="preserve"> </w:t>
+      </w:r>
+      <w:r>
+        <w:rPr>
+          <w:lang w:val="pt-BR"/>
+        </w:rPr>
+        <w:t xml:space="preserve"> </w:t>
+      </w:r>
+      <w:hyperlink r:id="rId17" w:history="1">
         <w:r>
           <w:rPr>
             <w:rStyle w:val="Hyperlink"/>
             <w:rFonts w:ascii="Times New Roman" w:hAnsi="Times New Roman" w:cs="Times New Roman"/>
             <w:lang w:val="pt-BR"/>
           </w:rPr>
-          <w:t>Documentação oficial</w:t>
+          <w:t>https://docs.databricks.com/aws/en/spark/</w:t>
         </w:r>
       </w:hyperlink>
       <w:r>
@@ -13968,35 +13908,7 @@
           <w:rFonts w:ascii="Times New Roman" w:hAnsi="Times New Roman" w:cs="Times New Roman"/>
           <w:lang w:val="pt-BR"/>
         </w:rPr>
-        <w:t xml:space="preserve">. </w:t>
-      </w:r>
-      <w:proofErr w:type="spellStart"/>
-      <w:r>
-        <w:rPr>
-          <w:rFonts w:ascii="Times New Roman" w:hAnsi="Times New Roman" w:cs="Times New Roman"/>
-        </w:rPr>
-        <w:t>Acesso</w:t>
-      </w:r>
-      <w:proofErr w:type="spellEnd"/>
-      <w:r>
-        <w:rPr>
-          <w:rFonts w:ascii="Times New Roman" w:hAnsi="Times New Roman" w:cs="Times New Roman"/>
-        </w:rPr>
-        <w:t xml:space="preserve"> </w:t>
-      </w:r>
-      <w:proofErr w:type="spellStart"/>
-      <w:r>
-        <w:rPr>
-          <w:rFonts w:ascii="Times New Roman" w:hAnsi="Times New Roman" w:cs="Times New Roman"/>
-        </w:rPr>
-        <w:t>em</w:t>
-      </w:r>
-      <w:proofErr w:type="spellEnd"/>
-      <w:r>
-        <w:rPr>
-          <w:rFonts w:ascii="Times New Roman" w:hAnsi="Times New Roman" w:cs="Times New Roman"/>
-        </w:rPr>
-        <w:t>: 6 set. 2026.</w:t>
+        <w:t>. Acesso em: 6 set. 2026.</w:t>
       </w:r>
     </w:p>
     <w:p>
@@ -14005,6 +13917,7 @@
         <w:jc w:val="both"/>
         <w:rPr>
           <w:rFonts w:ascii="Times New Roman" w:hAnsi="Times New Roman" w:cs="Times New Roman"/>
+          <w:lang w:val="pt-BR"/>
         </w:rPr>
       </w:pPr>
     </w:p>
@@ -14014,421 +13927,162 @@
         <w:jc w:val="both"/>
         <w:rPr>
           <w:rFonts w:ascii="Times New Roman" w:hAnsi="Times New Roman" w:cs="Times New Roman"/>
-        </w:rPr>
-      </w:pPr>
-      <w:r>
-        <w:rPr>
-          <w:rFonts w:ascii="Times New Roman" w:hAnsi="Times New Roman" w:cs="Times New Roman"/>
-        </w:rPr>
-        <w:t xml:space="preserve">GOUR, V. et al. Improve performance of extract, transform and load (ETL) in data warehouse. </w:t>
-      </w:r>
+          <w:lang w:val="pt-BR"/>
+        </w:rPr>
+      </w:pPr>
+      <w:r>
+        <w:rPr>
+          <w:rFonts w:ascii="Times New Roman" w:hAnsi="Times New Roman" w:cs="Times New Roman"/>
+          <w:lang w:val="pt-BR"/>
+        </w:rPr>
+        <w:t xml:space="preserve">DATABRICKS. </w:t>
+      </w:r>
+      <w:proofErr w:type="spellStart"/>
       <w:r>
         <w:rPr>
           <w:rFonts w:ascii="Times New Roman" w:hAnsi="Times New Roman" w:cs="Times New Roman"/>
           <w:b/>
           <w:bCs/>
-        </w:rPr>
-        <w:t>International Journal on Computer Science and Engineering</w:t>
-      </w:r>
-      <w:r>
-        <w:rPr>
-          <w:rFonts w:ascii="Times New Roman" w:hAnsi="Times New Roman" w:cs="Times New Roman"/>
-        </w:rPr>
-        <w:t xml:space="preserve">, v. 2, n. 3, p. 786–789, 2010. </w:t>
-      </w:r>
-      <w:proofErr w:type="spellStart"/>
-      <w:r>
-        <w:rPr>
-          <w:rFonts w:ascii="Times New Roman" w:hAnsi="Times New Roman" w:cs="Times New Roman"/>
-        </w:rPr>
-        <w:t>Disponível</w:t>
-      </w:r>
-      <w:proofErr w:type="spellEnd"/>
-      <w:r>
-        <w:rPr>
-          <w:rFonts w:ascii="Times New Roman" w:hAnsi="Times New Roman" w:cs="Times New Roman"/>
-        </w:rPr>
-        <w:t xml:space="preserve"> </w:t>
-      </w:r>
-      <w:proofErr w:type="spellStart"/>
-      <w:r>
-        <w:rPr>
-          <w:rFonts w:ascii="Times New Roman" w:hAnsi="Times New Roman" w:cs="Times New Roman"/>
-        </w:rPr>
-        <w:t>em</w:t>
-      </w:r>
-      <w:proofErr w:type="spellEnd"/>
-      <w:r>
-        <w:rPr>
-          <w:rFonts w:ascii="Times New Roman" w:hAnsi="Times New Roman" w:cs="Times New Roman"/>
-        </w:rPr>
-        <w:t xml:space="preserve">: </w:t>
-      </w:r>
+          <w:lang w:val="pt-BR"/>
+        </w:rPr>
+        <w:t>Databricks</w:t>
+      </w:r>
+      <w:proofErr w:type="spellEnd"/>
       <w:r>
         <w:rPr>
           <w:rFonts w:ascii="Times New Roman" w:hAnsi="Times New Roman" w:cs="Times New Roman"/>
           <w:b/>
           <w:bCs/>
-        </w:rPr>
-        <w:t>[INSERIR LINK]</w:t>
-      </w:r>
-      <w:r>
-        <w:rPr>
-          <w:rFonts w:ascii="Times New Roman" w:hAnsi="Times New Roman" w:cs="Times New Roman"/>
-        </w:rPr>
-        <w:t xml:space="preserve">. </w:t>
-      </w:r>
-      <w:proofErr w:type="spellStart"/>
-      <w:r>
-        <w:rPr>
-          <w:rFonts w:ascii="Times New Roman" w:hAnsi="Times New Roman" w:cs="Times New Roman"/>
-        </w:rPr>
-        <w:t>Acesso</w:t>
-      </w:r>
-      <w:proofErr w:type="spellEnd"/>
-      <w:r>
-        <w:rPr>
-          <w:rFonts w:ascii="Times New Roman" w:hAnsi="Times New Roman" w:cs="Times New Roman"/>
-        </w:rPr>
-        <w:t xml:space="preserve"> </w:t>
-      </w:r>
-      <w:proofErr w:type="spellStart"/>
-      <w:r>
-        <w:rPr>
-          <w:rFonts w:ascii="Times New Roman" w:hAnsi="Times New Roman" w:cs="Times New Roman"/>
-        </w:rPr>
-        <w:t>em</w:t>
-      </w:r>
-      <w:proofErr w:type="spellEnd"/>
-      <w:r>
-        <w:rPr>
-          <w:rFonts w:ascii="Times New Roman" w:hAnsi="Times New Roman" w:cs="Times New Roman"/>
-        </w:rPr>
-        <w:t>: 6 set. 2026.</w:t>
-      </w:r>
-    </w:p>
-    <w:p>
-      <w:pPr>
-        <w:spacing w:after="0" w:line="240" w:lineRule="auto"/>
-        <w:jc w:val="both"/>
-        <w:rPr>
-          <w:rFonts w:ascii="Times New Roman" w:hAnsi="Times New Roman" w:cs="Times New Roman"/>
-        </w:rPr>
-      </w:pPr>
-    </w:p>
-    <w:p>
-      <w:pPr>
-        <w:spacing w:after="0" w:line="240" w:lineRule="auto"/>
-        <w:jc w:val="both"/>
-        <w:rPr>
-          <w:rFonts w:ascii="Times New Roman" w:hAnsi="Times New Roman" w:cs="Times New Roman"/>
-        </w:rPr>
-      </w:pPr>
-      <w:r>
-        <w:rPr>
-          <w:rFonts w:ascii="Times New Roman" w:hAnsi="Times New Roman" w:cs="Times New Roman"/>
-        </w:rPr>
-        <w:t xml:space="preserve">KIMBALL, R.; ROSS, M. </w:t>
-      </w:r>
+          <w:lang w:val="pt-BR"/>
+        </w:rPr>
+        <w:t xml:space="preserve"> Free </w:t>
+      </w:r>
+      <w:proofErr w:type="spellStart"/>
       <w:r>
         <w:rPr>
           <w:rFonts w:ascii="Times New Roman" w:hAnsi="Times New Roman" w:cs="Times New Roman"/>
           <w:b/>
           <w:bCs/>
-        </w:rPr>
-        <w:t>The Data Warehouse Toolkit: The Complete Guide to Dimensional Modeling</w:t>
-      </w:r>
-      <w:r>
-        <w:rPr>
-          <w:rFonts w:ascii="Times New Roman" w:hAnsi="Times New Roman" w:cs="Times New Roman"/>
-        </w:rPr>
-        <w:t xml:space="preserve">. 2. ed. New York: Wiley, 2002. </w:t>
-      </w:r>
-      <w:proofErr w:type="spellStart"/>
-      <w:r>
-        <w:rPr>
-          <w:rFonts w:ascii="Times New Roman" w:hAnsi="Times New Roman" w:cs="Times New Roman"/>
-        </w:rPr>
-        <w:t>Disponível</w:t>
-      </w:r>
-      <w:proofErr w:type="spellEnd"/>
-      <w:r>
-        <w:rPr>
-          <w:rFonts w:ascii="Times New Roman" w:hAnsi="Times New Roman" w:cs="Times New Roman"/>
+          <w:lang w:val="pt-BR"/>
+        </w:rPr>
+        <w:t>Edition</w:t>
+      </w:r>
+      <w:proofErr w:type="spellEnd"/>
+      <w:r>
+        <w:rPr>
+          <w:rFonts w:ascii="Times New Roman" w:hAnsi="Times New Roman" w:cs="Times New Roman"/>
+          <w:lang w:val="pt-BR"/>
+        </w:rPr>
+        <w:t>. 2026b. Disponível em:</w:t>
+      </w:r>
+      <w:r>
+        <w:rPr>
+          <w:lang w:val="pt-BR"/>
         </w:rPr>
         <w:t xml:space="preserve"> </w:t>
       </w:r>
-      <w:proofErr w:type="spellStart"/>
-      <w:r>
-        <w:rPr>
-          <w:rFonts w:ascii="Times New Roman" w:hAnsi="Times New Roman" w:cs="Times New Roman"/>
-        </w:rPr>
-        <w:t>em</w:t>
-      </w:r>
-      <w:proofErr w:type="spellEnd"/>
-      <w:r>
-        <w:rPr>
-          <w:rFonts w:ascii="Times New Roman" w:hAnsi="Times New Roman" w:cs="Times New Roman"/>
-        </w:rPr>
-        <w:t xml:space="preserve">: </w:t>
-      </w:r>
-      <w:hyperlink r:id="rId20" w:tgtFrame="_blank" w:history="1">
-        <w:r>
-          <w:rPr>
-            <w:rStyle w:val="Hyperlink"/>
-            <w:rFonts w:ascii="Times New Roman" w:hAnsi="Times New Roman" w:cs="Times New Roman"/>
-          </w:rPr>
-          <w:t>Wiley – The Data Warehouse Toolkit, 2nd Edition</w:t>
-        </w:r>
-      </w:hyperlink>
-      <w:r>
-        <w:rPr>
-          <w:rFonts w:ascii="Times New Roman" w:hAnsi="Times New Roman" w:cs="Times New Roman"/>
-        </w:rPr>
-        <w:t xml:space="preserve">. </w:t>
-      </w:r>
-      <w:proofErr w:type="spellStart"/>
-      <w:r>
-        <w:rPr>
-          <w:rFonts w:ascii="Times New Roman" w:hAnsi="Times New Roman" w:cs="Times New Roman"/>
-        </w:rPr>
-        <w:t>Acesso</w:t>
-      </w:r>
-      <w:proofErr w:type="spellEnd"/>
-      <w:r>
-        <w:rPr>
-          <w:rFonts w:ascii="Times New Roman" w:hAnsi="Times New Roman" w:cs="Times New Roman"/>
-        </w:rPr>
-        <w:t xml:space="preserve"> </w:t>
-      </w:r>
-      <w:proofErr w:type="spellStart"/>
-      <w:r>
-        <w:rPr>
-          <w:rFonts w:ascii="Times New Roman" w:hAnsi="Times New Roman" w:cs="Times New Roman"/>
-        </w:rPr>
-        <w:t>em</w:t>
-      </w:r>
-      <w:proofErr w:type="spellEnd"/>
-      <w:r>
-        <w:rPr>
-          <w:rFonts w:ascii="Times New Roman" w:hAnsi="Times New Roman" w:cs="Times New Roman"/>
-        </w:rPr>
-        <w:t xml:space="preserve">: 6 set. 2026. </w:t>
-      </w:r>
-    </w:p>
-    <w:p>
-      <w:pPr>
-        <w:spacing w:after="0" w:line="240" w:lineRule="auto"/>
-        <w:jc w:val="both"/>
-        <w:rPr>
-          <w:rFonts w:ascii="Times New Roman" w:hAnsi="Times New Roman" w:cs="Times New Roman"/>
-        </w:rPr>
-      </w:pPr>
-    </w:p>
-    <w:p>
-      <w:pPr>
-        <w:spacing w:after="0" w:line="240" w:lineRule="auto"/>
-        <w:jc w:val="both"/>
-        <w:rPr>
-          <w:rFonts w:ascii="Times New Roman" w:hAnsi="Times New Roman" w:cs="Times New Roman"/>
-        </w:rPr>
-      </w:pPr>
-      <w:r>
-        <w:rPr>
-          <w:rFonts w:ascii="Times New Roman" w:hAnsi="Times New Roman" w:cs="Times New Roman"/>
-        </w:rPr>
-        <w:t xml:space="preserve">L'ESTEVE, R. </w:t>
-      </w:r>
-      <w:r>
-        <w:rPr>
-          <w:rFonts w:ascii="Times New Roman" w:hAnsi="Times New Roman" w:cs="Times New Roman"/>
-          <w:b/>
-          <w:bCs/>
-        </w:rPr>
-        <w:t xml:space="preserve">The Azure Data Lakehouse Toolkit: Building and Scaling Data </w:t>
-      </w:r>
-      <w:proofErr w:type="spellStart"/>
-      <w:r>
-        <w:rPr>
-          <w:rFonts w:ascii="Times New Roman" w:hAnsi="Times New Roman" w:cs="Times New Roman"/>
-          <w:b/>
-          <w:bCs/>
-        </w:rPr>
-        <w:t>Lakehouses</w:t>
-      </w:r>
-      <w:proofErr w:type="spellEnd"/>
-      <w:r>
-        <w:rPr>
-          <w:rFonts w:ascii="Times New Roman" w:hAnsi="Times New Roman" w:cs="Times New Roman"/>
-          <w:b/>
-          <w:bCs/>
-        </w:rPr>
-        <w:t xml:space="preserve"> on Azure with Delta Lake, Apache Spark, Databricks, Synapse Analytics, and Snowflake</w:t>
-      </w:r>
-      <w:r>
-        <w:rPr>
-          <w:rFonts w:ascii="Times New Roman" w:hAnsi="Times New Roman" w:cs="Times New Roman"/>
-        </w:rPr>
-        <w:t xml:space="preserve">. Berkeley, CA: </w:t>
-      </w:r>
-      <w:proofErr w:type="spellStart"/>
-      <w:r>
-        <w:rPr>
-          <w:rFonts w:ascii="Times New Roman" w:hAnsi="Times New Roman" w:cs="Times New Roman"/>
-        </w:rPr>
-        <w:t>Apress</w:t>
-      </w:r>
-      <w:proofErr w:type="spellEnd"/>
-      <w:r>
-        <w:rPr>
-          <w:rFonts w:ascii="Times New Roman" w:hAnsi="Times New Roman" w:cs="Times New Roman"/>
-        </w:rPr>
-        <w:t xml:space="preserve">, 2022. DOI: 10.1007/978-1-4842-8233-5. </w:t>
-      </w:r>
-      <w:proofErr w:type="spellStart"/>
-      <w:r>
-        <w:rPr>
-          <w:rFonts w:ascii="Times New Roman" w:hAnsi="Times New Roman" w:cs="Times New Roman"/>
-        </w:rPr>
-        <w:t>Disponível</w:t>
-      </w:r>
-      <w:proofErr w:type="spellEnd"/>
-      <w:r>
-        <w:rPr>
-          <w:rFonts w:ascii="Times New Roman" w:hAnsi="Times New Roman" w:cs="Times New Roman"/>
-        </w:rPr>
-        <w:t xml:space="preserve"> </w:t>
-      </w:r>
-      <w:proofErr w:type="spellStart"/>
-      <w:r>
-        <w:rPr>
-          <w:rFonts w:ascii="Times New Roman" w:hAnsi="Times New Roman" w:cs="Times New Roman"/>
-        </w:rPr>
-        <w:t>em</w:t>
-      </w:r>
-      <w:proofErr w:type="spellEnd"/>
-      <w:r>
-        <w:rPr>
-          <w:rFonts w:ascii="Times New Roman" w:hAnsi="Times New Roman" w:cs="Times New Roman"/>
-        </w:rPr>
-        <w:t xml:space="preserve">: </w:t>
-      </w:r>
-      <w:hyperlink r:id="rId21" w:tgtFrame="_blank" w:history="1">
-        <w:r>
-          <w:rPr>
-            <w:rStyle w:val="Hyperlink"/>
-            <w:rFonts w:ascii="Times New Roman" w:hAnsi="Times New Roman" w:cs="Times New Roman"/>
-          </w:rPr>
-          <w:t>Springer Nature – The Azure Data Lakehouse Toolkit</w:t>
-        </w:r>
-      </w:hyperlink>
-      <w:r>
-        <w:rPr>
-          <w:rFonts w:ascii="Times New Roman" w:hAnsi="Times New Roman" w:cs="Times New Roman"/>
-        </w:rPr>
-        <w:t xml:space="preserve">. </w:t>
-      </w:r>
-      <w:proofErr w:type="spellStart"/>
-      <w:r>
-        <w:rPr>
-          <w:rFonts w:ascii="Times New Roman" w:hAnsi="Times New Roman" w:cs="Times New Roman"/>
-        </w:rPr>
-        <w:t>Acesso</w:t>
-      </w:r>
-      <w:proofErr w:type="spellEnd"/>
-      <w:r>
-        <w:rPr>
-          <w:rFonts w:ascii="Times New Roman" w:hAnsi="Times New Roman" w:cs="Times New Roman"/>
-        </w:rPr>
-        <w:t xml:space="preserve"> </w:t>
-      </w:r>
-      <w:proofErr w:type="spellStart"/>
-      <w:r>
-        <w:rPr>
-          <w:rFonts w:ascii="Times New Roman" w:hAnsi="Times New Roman" w:cs="Times New Roman"/>
-        </w:rPr>
-        <w:t>em</w:t>
-      </w:r>
-      <w:proofErr w:type="spellEnd"/>
-      <w:r>
-        <w:rPr>
-          <w:rFonts w:ascii="Times New Roman" w:hAnsi="Times New Roman" w:cs="Times New Roman"/>
-        </w:rPr>
-        <w:t xml:space="preserve">: 6 set. 2026. </w:t>
-      </w:r>
-    </w:p>
-    <w:p>
-      <w:pPr>
-        <w:spacing w:after="0" w:line="240" w:lineRule="auto"/>
-        <w:jc w:val="both"/>
-        <w:rPr>
-          <w:rFonts w:ascii="Times New Roman" w:hAnsi="Times New Roman" w:cs="Times New Roman"/>
-        </w:rPr>
-      </w:pPr>
-      <w:r>
-        <w:rPr>
-          <w:rFonts w:ascii="Times New Roman" w:hAnsi="Times New Roman" w:cs="Times New Roman"/>
-        </w:rPr>
-        <w:t xml:space="preserve">PENTAHO. </w:t>
-      </w:r>
-      <w:r>
-        <w:rPr>
-          <w:rFonts w:ascii="Times New Roman" w:hAnsi="Times New Roman" w:cs="Times New Roman"/>
-          <w:b/>
-          <w:bCs/>
-        </w:rPr>
-        <w:t>Basic concepts of ETL in PDI</w:t>
-      </w:r>
-      <w:r>
-        <w:rPr>
-          <w:rFonts w:ascii="Times New Roman" w:hAnsi="Times New Roman" w:cs="Times New Roman"/>
-        </w:rPr>
-        <w:t xml:space="preserve">. 2026. </w:t>
-      </w:r>
-      <w:r>
-        <w:rPr>
-          <w:rFonts w:ascii="Times New Roman" w:hAnsi="Times New Roman" w:cs="Times New Roman"/>
-          <w:lang w:val="pt-BR"/>
-        </w:rPr>
-        <w:t xml:space="preserve">Disponível em: </w:t>
-      </w:r>
-      <w:hyperlink r:id="rId22" w:tgtFrame="_blank" w:history="1">
+      <w:hyperlink r:id="rId18" w:history="1">
         <w:r>
           <w:rPr>
             <w:rStyle w:val="Hyperlink"/>
             <w:rFonts w:ascii="Times New Roman" w:hAnsi="Times New Roman" w:cs="Times New Roman"/>
             <w:lang w:val="pt-BR"/>
           </w:rPr>
-          <w:t xml:space="preserve">Documentação oficial do </w:t>
+          <w:t>https://docs.databricks.com/aws/en/getting-started/free-edition</w:t>
         </w:r>
-        <w:proofErr w:type="spellStart"/>
+      </w:hyperlink>
+      <w:r>
+        <w:rPr>
+          <w:rFonts w:ascii="Times New Roman" w:hAnsi="Times New Roman" w:cs="Times New Roman"/>
+          <w:lang w:val="pt-BR"/>
+        </w:rPr>
+        <w:t>. Acesso em: 6 set. 2026.</w:t>
+      </w:r>
+    </w:p>
+    <w:p>
+      <w:pPr>
+        <w:spacing w:after="0" w:line="240" w:lineRule="auto"/>
+        <w:jc w:val="both"/>
+        <w:rPr>
+          <w:rFonts w:ascii="Times New Roman" w:hAnsi="Times New Roman" w:cs="Times New Roman"/>
+          <w:lang w:val="pt-BR"/>
+        </w:rPr>
+      </w:pPr>
+    </w:p>
+    <w:p>
+      <w:pPr>
+        <w:spacing w:after="0" w:line="240" w:lineRule="auto"/>
+        <w:jc w:val="both"/>
+        <w:rPr>
+          <w:rFonts w:ascii="Times New Roman" w:hAnsi="Times New Roman" w:cs="Times New Roman"/>
+        </w:rPr>
+      </w:pPr>
+      <w:r>
+        <w:rPr>
+          <w:rFonts w:ascii="Times New Roman" w:hAnsi="Times New Roman" w:cs="Times New Roman"/>
+          <w:lang w:val="pt-BR"/>
+        </w:rPr>
+        <w:t xml:space="preserve">DATABRICKS. </w:t>
+      </w:r>
+      <w:proofErr w:type="spellStart"/>
+      <w:r>
+        <w:rPr>
+          <w:rFonts w:ascii="Times New Roman" w:hAnsi="Times New Roman" w:cs="Times New Roman"/>
+          <w:b/>
+          <w:bCs/>
+          <w:lang w:val="pt-BR"/>
+        </w:rPr>
+        <w:t>Serverless</w:t>
+      </w:r>
+      <w:proofErr w:type="spellEnd"/>
+      <w:r>
+        <w:rPr>
+          <w:rFonts w:ascii="Times New Roman" w:hAnsi="Times New Roman" w:cs="Times New Roman"/>
+          <w:b/>
+          <w:bCs/>
+          <w:lang w:val="pt-BR"/>
+        </w:rPr>
+        <w:t xml:space="preserve"> compute for notebooks</w:t>
+      </w:r>
+      <w:r>
+        <w:rPr>
+          <w:rFonts w:ascii="Times New Roman" w:hAnsi="Times New Roman" w:cs="Times New Roman"/>
+          <w:lang w:val="pt-BR"/>
+        </w:rPr>
+        <w:t>. 2026c. Disponível em:</w:t>
+      </w:r>
+      <w:r>
+        <w:rPr>
+          <w:rFonts w:ascii="Times New Roman" w:hAnsi="Times New Roman" w:cs="Times New Roman"/>
+          <w:lang w:val="pt-BR"/>
+        </w:rPr>
+        <w:t xml:space="preserve"> </w:t>
+      </w:r>
+      <w:hyperlink r:id="rId19" w:history="1">
         <w:r>
           <w:rPr>
             <w:rStyle w:val="Hyperlink"/>
             <w:rFonts w:ascii="Times New Roman" w:hAnsi="Times New Roman" w:cs="Times New Roman"/>
             <w:lang w:val="pt-BR"/>
           </w:rPr>
-          <w:t>Pentaho</w:t>
+          <w:t>https://docs.databricks.com/aws/en/compute/serverless/note</w:t>
         </w:r>
-        <w:proofErr w:type="spellEnd"/>
         <w:r>
           <w:rPr>
             <w:rStyle w:val="Hyperlink"/>
             <w:rFonts w:ascii="Times New Roman" w:hAnsi="Times New Roman" w:cs="Times New Roman"/>
             <w:lang w:val="pt-BR"/>
           </w:rPr>
-          <w:t xml:space="preserve"> Data </w:t>
+          <w:t>b</w:t>
         </w:r>
-        <w:proofErr w:type="spellStart"/>
         <w:r>
           <w:rPr>
             <w:rStyle w:val="Hyperlink"/>
             <w:rFonts w:ascii="Times New Roman" w:hAnsi="Times New Roman" w:cs="Times New Roman"/>
             <w:lang w:val="pt-BR"/>
           </w:rPr>
-          <w:t>Integration</w:t>
+          <w:t>ooks</w:t>
         </w:r>
-        <w:proofErr w:type="spellEnd"/>
       </w:hyperlink>
       <w:r>
         <w:rPr>
@@ -14481,14 +14135,25 @@
         <w:jc w:val="both"/>
         <w:rPr>
           <w:rFonts w:ascii="Times New Roman" w:hAnsi="Times New Roman" w:cs="Times New Roman"/>
-          <w:lang w:val="pt-BR"/>
-        </w:rPr>
-      </w:pPr>
-      <w:r>
-        <w:rPr>
-          <w:rFonts w:ascii="Times New Roman" w:hAnsi="Times New Roman" w:cs="Times New Roman"/>
-        </w:rPr>
-        <w:t xml:space="preserve">SINGU, S. K. Designing scalable data engineering pipelines using Azure and Databricks. </w:t>
+        </w:rPr>
+      </w:pPr>
+      <w:r>
+        <w:rPr>
+          <w:rFonts w:ascii="Times New Roman" w:hAnsi="Times New Roman" w:cs="Times New Roman"/>
+        </w:rPr>
+        <w:t>GO</w:t>
+      </w:r>
+      <w:r>
+        <w:rPr>
+          <w:rFonts w:ascii="Times New Roman" w:hAnsi="Times New Roman" w:cs="Times New Roman"/>
+        </w:rPr>
+        <w:t>A</w:t>
+      </w:r>
+      <w:r>
+        <w:rPr>
+          <w:rFonts w:ascii="Times New Roman" w:hAnsi="Times New Roman" w:cs="Times New Roman"/>
+        </w:rPr>
+        <w:t xml:space="preserve">R, V. et al. Improve performance of extract, transform and load (ETL) in data warehouse. </w:t>
       </w:r>
       <w:r>
         <w:rPr>
@@ -14496,229 +14161,645 @@
           <w:b/>
           <w:bCs/>
         </w:rPr>
-        <w:t>ESP Journal of Engineering &amp; Technology Advancements</w:t>
-      </w:r>
-      <w:r>
-        <w:rPr>
-          <w:rFonts w:ascii="Times New Roman" w:hAnsi="Times New Roman" w:cs="Times New Roman"/>
-        </w:rPr>
-        <w:t xml:space="preserve">, v. 1, n. 2, p. 176–187, 2021. DOI: 10.56472/25832646/JETA-V1I2P119. </w:t>
-      </w:r>
-      <w:r>
-        <w:rPr>
-          <w:rFonts w:ascii="Times New Roman" w:hAnsi="Times New Roman" w:cs="Times New Roman"/>
-          <w:lang w:val="pt-BR"/>
-        </w:rPr>
-        <w:t xml:space="preserve">Disponível em: </w:t>
-      </w:r>
-      <w:hyperlink r:id="rId23" w:tgtFrame="_blank" w:history="1">
+        <w:t>International Journal on Computer Science and Engineering</w:t>
+      </w:r>
+      <w:r>
+        <w:rPr>
+          <w:rFonts w:ascii="Times New Roman" w:hAnsi="Times New Roman" w:cs="Times New Roman"/>
+        </w:rPr>
+        <w:t xml:space="preserve">, v. 2, n. 3, p. 786–789, 2010. </w:t>
+      </w:r>
+      <w:r>
+        <w:rPr>
+          <w:rFonts w:ascii="Times New Roman" w:hAnsi="Times New Roman" w:cs="Times New Roman"/>
+          <w:lang w:val="pt-BR"/>
+        </w:rPr>
+        <w:t>Disponível em:</w:t>
+      </w:r>
+      <w:r>
+        <w:rPr>
+          <w:lang w:val="pt-BR"/>
+        </w:rPr>
+        <w:t xml:space="preserve"> </w:t>
+      </w:r>
+      <w:hyperlink r:id="rId20" w:history="1">
         <w:r>
           <w:rPr>
             <w:rStyle w:val="Hyperlink"/>
             <w:rFonts w:ascii="Times New Roman" w:hAnsi="Times New Roman" w:cs="Times New Roman"/>
             <w:lang w:val="pt-BR"/>
           </w:rPr>
-          <w:t xml:space="preserve">ESP </w:t>
+          <w:t>https://www.researchgate.net/publication/49618608_Improve_Performance_of_Extract_Transform_and_Load_ETL_in_Data_Warehouse</w:t>
         </w:r>
-        <w:proofErr w:type="spellStart"/>
+      </w:hyperlink>
+      <w:r>
+        <w:rPr>
+          <w:rFonts w:ascii="Times New Roman" w:hAnsi="Times New Roman" w:cs="Times New Roman"/>
+          <w:lang w:val="pt-BR"/>
+        </w:rPr>
+        <w:t xml:space="preserve">. </w:t>
+      </w:r>
+      <w:proofErr w:type="spellStart"/>
+      <w:r>
+        <w:rPr>
+          <w:rFonts w:ascii="Times New Roman" w:hAnsi="Times New Roman" w:cs="Times New Roman"/>
+        </w:rPr>
+        <w:t>Acesso</w:t>
+      </w:r>
+      <w:proofErr w:type="spellEnd"/>
+      <w:r>
+        <w:rPr>
+          <w:rFonts w:ascii="Times New Roman" w:hAnsi="Times New Roman" w:cs="Times New Roman"/>
+        </w:rPr>
+        <w:t xml:space="preserve"> </w:t>
+      </w:r>
+      <w:proofErr w:type="spellStart"/>
+      <w:r>
+        <w:rPr>
+          <w:rFonts w:ascii="Times New Roman" w:hAnsi="Times New Roman" w:cs="Times New Roman"/>
+        </w:rPr>
+        <w:t>em</w:t>
+      </w:r>
+      <w:proofErr w:type="spellEnd"/>
+      <w:r>
+        <w:rPr>
+          <w:rFonts w:ascii="Times New Roman" w:hAnsi="Times New Roman" w:cs="Times New Roman"/>
+        </w:rPr>
+        <w:t>: 6 set. 2026.</w:t>
+      </w:r>
+    </w:p>
+    <w:p>
+      <w:pPr>
+        <w:spacing w:after="0" w:line="240" w:lineRule="auto"/>
+        <w:jc w:val="both"/>
+        <w:rPr>
+          <w:rFonts w:ascii="Times New Roman" w:hAnsi="Times New Roman" w:cs="Times New Roman"/>
+        </w:rPr>
+      </w:pPr>
+    </w:p>
+    <w:p>
+      <w:pPr>
+        <w:spacing w:after="0" w:line="240" w:lineRule="auto"/>
+        <w:jc w:val="both"/>
+        <w:rPr>
+          <w:rFonts w:ascii="Times New Roman" w:hAnsi="Times New Roman" w:cs="Times New Roman"/>
+        </w:rPr>
+      </w:pPr>
+      <w:r>
+        <w:rPr>
+          <w:rFonts w:ascii="Times New Roman" w:hAnsi="Times New Roman" w:cs="Times New Roman"/>
+        </w:rPr>
+        <w:t xml:space="preserve">KIMBALL, R.; ROSS, M. </w:t>
+      </w:r>
+      <w:r>
+        <w:rPr>
+          <w:rFonts w:ascii="Times New Roman" w:hAnsi="Times New Roman" w:cs="Times New Roman"/>
+          <w:b/>
+          <w:bCs/>
+        </w:rPr>
+        <w:t>The Data Warehouse Toolkit: The Complete Guide to Dimensional Modeling</w:t>
+      </w:r>
+      <w:r>
+        <w:rPr>
+          <w:rFonts w:ascii="Times New Roman" w:hAnsi="Times New Roman" w:cs="Times New Roman"/>
+        </w:rPr>
+        <w:t xml:space="preserve">. 2. ed. New York: Wiley, 2002. </w:t>
+      </w:r>
+      <w:r>
+        <w:rPr>
+          <w:rFonts w:ascii="Times New Roman" w:hAnsi="Times New Roman" w:cs="Times New Roman"/>
+          <w:lang w:val="pt-BR"/>
+        </w:rPr>
+        <w:t>Disponível em:</w:t>
+      </w:r>
+      <w:r>
+        <w:rPr>
+          <w:lang w:val="pt-BR"/>
+        </w:rPr>
+        <w:t xml:space="preserve"> </w:t>
+      </w:r>
+      <w:hyperlink r:id="rId21" w:history="1">
         <w:r>
           <w:rPr>
             <w:rStyle w:val="Hyperlink"/>
             <w:rFonts w:ascii="Times New Roman" w:hAnsi="Times New Roman" w:cs="Times New Roman"/>
             <w:lang w:val="pt-BR"/>
           </w:rPr>
-          <w:t>Journal</w:t>
+          <w:t>https://uat.store.wiley.com/en-us/shop/general-introductory-computer-science/the-data-warehouse-toolkit-the-complete-guide-to-dimensional-modeling-2nd-edition-p-9780471200246</w:t>
         </w:r>
-        <w:proofErr w:type="spellEnd"/>
+      </w:hyperlink>
+      <w:r>
+        <w:rPr>
+          <w:rFonts w:ascii="Times New Roman" w:hAnsi="Times New Roman" w:cs="Times New Roman"/>
+          <w:lang w:val="pt-BR"/>
+        </w:rPr>
+        <w:t xml:space="preserve">. </w:t>
+      </w:r>
+      <w:proofErr w:type="spellStart"/>
+      <w:r>
+        <w:rPr>
+          <w:rFonts w:ascii="Times New Roman" w:hAnsi="Times New Roman" w:cs="Times New Roman"/>
+        </w:rPr>
+        <w:t>Acesso</w:t>
+      </w:r>
+      <w:proofErr w:type="spellEnd"/>
+      <w:r>
+        <w:rPr>
+          <w:rFonts w:ascii="Times New Roman" w:hAnsi="Times New Roman" w:cs="Times New Roman"/>
+        </w:rPr>
+        <w:t xml:space="preserve"> </w:t>
+      </w:r>
+      <w:proofErr w:type="spellStart"/>
+      <w:r>
+        <w:rPr>
+          <w:rFonts w:ascii="Times New Roman" w:hAnsi="Times New Roman" w:cs="Times New Roman"/>
+        </w:rPr>
+        <w:t>em</w:t>
+      </w:r>
+      <w:proofErr w:type="spellEnd"/>
+      <w:r>
+        <w:rPr>
+          <w:rFonts w:ascii="Times New Roman" w:hAnsi="Times New Roman" w:cs="Times New Roman"/>
+        </w:rPr>
+        <w:t xml:space="preserve">: 6 set. 2026. </w:t>
+      </w:r>
+    </w:p>
+    <w:p>
+      <w:pPr>
+        <w:spacing w:after="0" w:line="240" w:lineRule="auto"/>
+        <w:jc w:val="both"/>
+        <w:rPr>
+          <w:rFonts w:ascii="Times New Roman" w:hAnsi="Times New Roman" w:cs="Times New Roman"/>
+        </w:rPr>
+      </w:pPr>
+    </w:p>
+    <w:p>
+      <w:pPr>
+        <w:spacing w:after="0" w:line="240" w:lineRule="auto"/>
+        <w:jc w:val="both"/>
+        <w:rPr>
+          <w:rFonts w:ascii="Times New Roman" w:hAnsi="Times New Roman" w:cs="Times New Roman"/>
+        </w:rPr>
+      </w:pPr>
+      <w:r>
+        <w:rPr>
+          <w:rFonts w:ascii="Times New Roman" w:hAnsi="Times New Roman" w:cs="Times New Roman"/>
+        </w:rPr>
+        <w:t xml:space="preserve">L'ESTEVE, R. </w:t>
+      </w:r>
+      <w:r>
+        <w:rPr>
+          <w:rFonts w:ascii="Times New Roman" w:hAnsi="Times New Roman" w:cs="Times New Roman"/>
+          <w:b/>
+          <w:bCs/>
+        </w:rPr>
+        <w:t xml:space="preserve">The Azure Data Lakehouse Toolkit: Building and Scaling Data </w:t>
+      </w:r>
+      <w:proofErr w:type="spellStart"/>
+      <w:r>
+        <w:rPr>
+          <w:rFonts w:ascii="Times New Roman" w:hAnsi="Times New Roman" w:cs="Times New Roman"/>
+          <w:b/>
+          <w:bCs/>
+        </w:rPr>
+        <w:t>Lakehouses</w:t>
+      </w:r>
+      <w:proofErr w:type="spellEnd"/>
+      <w:r>
+        <w:rPr>
+          <w:rFonts w:ascii="Times New Roman" w:hAnsi="Times New Roman" w:cs="Times New Roman"/>
+          <w:b/>
+          <w:bCs/>
+        </w:rPr>
+        <w:t xml:space="preserve"> on Azure with Delta Lake, Apache Spark, Databricks, Synapse Analytics, and Snowflake</w:t>
+      </w:r>
+      <w:r>
+        <w:rPr>
+          <w:rFonts w:ascii="Times New Roman" w:hAnsi="Times New Roman" w:cs="Times New Roman"/>
+        </w:rPr>
+        <w:t xml:space="preserve">. Berkeley, CA: </w:t>
+      </w:r>
+      <w:proofErr w:type="spellStart"/>
+      <w:r>
+        <w:rPr>
+          <w:rFonts w:ascii="Times New Roman" w:hAnsi="Times New Roman" w:cs="Times New Roman"/>
+        </w:rPr>
+        <w:t>Apress</w:t>
+      </w:r>
+      <w:proofErr w:type="spellEnd"/>
+      <w:r>
+        <w:rPr>
+          <w:rFonts w:ascii="Times New Roman" w:hAnsi="Times New Roman" w:cs="Times New Roman"/>
+        </w:rPr>
+        <w:t xml:space="preserve">, 2022. DOI: 10.1007/978-1-4842-8233-5. </w:t>
+      </w:r>
+      <w:proofErr w:type="spellStart"/>
+      <w:r>
+        <w:rPr>
+          <w:rFonts w:ascii="Times New Roman" w:hAnsi="Times New Roman" w:cs="Times New Roman"/>
+        </w:rPr>
+        <w:t>Disponível</w:t>
+      </w:r>
+      <w:proofErr w:type="spellEnd"/>
+      <w:r>
+        <w:rPr>
+          <w:rFonts w:ascii="Times New Roman" w:hAnsi="Times New Roman" w:cs="Times New Roman"/>
+        </w:rPr>
+        <w:t xml:space="preserve"> </w:t>
+      </w:r>
+      <w:proofErr w:type="spellStart"/>
+      <w:r>
+        <w:rPr>
+          <w:rFonts w:ascii="Times New Roman" w:hAnsi="Times New Roman" w:cs="Times New Roman"/>
+        </w:rPr>
+        <w:t>em</w:t>
+      </w:r>
+      <w:proofErr w:type="spellEnd"/>
+      <w:r>
+        <w:rPr>
+          <w:rFonts w:ascii="Times New Roman" w:hAnsi="Times New Roman" w:cs="Times New Roman"/>
+        </w:rPr>
+        <w:t>:</w:t>
+      </w:r>
+      <w:r>
+        <w:t xml:space="preserve"> </w:t>
+      </w:r>
+      <w:hyperlink r:id="rId22" w:history="1">
+        <w:r>
+          <w:rPr>
+            <w:rStyle w:val="Hyperlink"/>
+            <w:rFonts w:ascii="Times New Roman" w:hAnsi="Times New Roman" w:cs="Times New Roman"/>
+          </w:rPr>
+          <w:t>https://link.springer.com/book/10.1007/978-1-4842-8233-5</w:t>
+        </w:r>
+      </w:hyperlink>
+      <w:r>
+        <w:rPr>
+          <w:rFonts w:ascii="Times New Roman" w:hAnsi="Times New Roman" w:cs="Times New Roman"/>
+        </w:rPr>
+        <w:t xml:space="preserve">. </w:t>
+      </w:r>
+      <w:proofErr w:type="spellStart"/>
+      <w:r>
+        <w:rPr>
+          <w:rFonts w:ascii="Times New Roman" w:hAnsi="Times New Roman" w:cs="Times New Roman"/>
+        </w:rPr>
+        <w:t>Acesso</w:t>
+      </w:r>
+      <w:proofErr w:type="spellEnd"/>
+      <w:r>
+        <w:rPr>
+          <w:rFonts w:ascii="Times New Roman" w:hAnsi="Times New Roman" w:cs="Times New Roman"/>
+        </w:rPr>
+        <w:t xml:space="preserve"> </w:t>
+      </w:r>
+      <w:proofErr w:type="spellStart"/>
+      <w:r>
+        <w:rPr>
+          <w:rFonts w:ascii="Times New Roman" w:hAnsi="Times New Roman" w:cs="Times New Roman"/>
+        </w:rPr>
+        <w:t>em</w:t>
+      </w:r>
+      <w:proofErr w:type="spellEnd"/>
+      <w:r>
+        <w:rPr>
+          <w:rFonts w:ascii="Times New Roman" w:hAnsi="Times New Roman" w:cs="Times New Roman"/>
+        </w:rPr>
+        <w:t xml:space="preserve">: 6 set. 2026. </w:t>
+      </w:r>
+    </w:p>
+    <w:p>
+      <w:pPr>
+        <w:spacing w:after="0" w:line="240" w:lineRule="auto"/>
+        <w:jc w:val="both"/>
+        <w:rPr>
+          <w:rFonts w:ascii="Times New Roman" w:hAnsi="Times New Roman" w:cs="Times New Roman"/>
+        </w:rPr>
+      </w:pPr>
+    </w:p>
+    <w:p>
+      <w:pPr>
+        <w:spacing w:after="0" w:line="240" w:lineRule="auto"/>
+        <w:jc w:val="both"/>
+        <w:rPr>
+          <w:rFonts w:ascii="Times New Roman" w:hAnsi="Times New Roman" w:cs="Times New Roman"/>
+          <w:lang w:val="pt-BR"/>
+        </w:rPr>
+      </w:pPr>
+      <w:r>
+        <w:rPr>
+          <w:rFonts w:ascii="Times New Roman" w:hAnsi="Times New Roman" w:cs="Times New Roman"/>
+        </w:rPr>
+        <w:t xml:space="preserve">PENTAHO. </w:t>
+      </w:r>
+      <w:r>
+        <w:rPr>
+          <w:rFonts w:ascii="Times New Roman" w:hAnsi="Times New Roman" w:cs="Times New Roman"/>
+          <w:b/>
+          <w:bCs/>
+        </w:rPr>
+        <w:t>Basic concepts of ETL in PDI</w:t>
+      </w:r>
+      <w:r>
+        <w:rPr>
+          <w:rFonts w:ascii="Times New Roman" w:hAnsi="Times New Roman" w:cs="Times New Roman"/>
+        </w:rPr>
+        <w:t xml:space="preserve">. 2026. </w:t>
+      </w:r>
+      <w:r>
+        <w:rPr>
+          <w:rFonts w:ascii="Times New Roman" w:hAnsi="Times New Roman" w:cs="Times New Roman"/>
+          <w:lang w:val="pt-BR"/>
+        </w:rPr>
+        <w:t xml:space="preserve">Disponível em: </w:t>
+      </w:r>
+      <w:hyperlink r:id="rId23" w:history="1">
         <w:r>
           <w:rPr>
             <w:rStyle w:val="Hyperlink"/>
             <w:rFonts w:ascii="Times New Roman" w:hAnsi="Times New Roman" w:cs="Times New Roman"/>
             <w:lang w:val="pt-BR"/>
           </w:rPr>
-          <w:t xml:space="preserve"> – artigo oficial</w:t>
+          <w:t>https://docs.pentaho.com/pdia-data-integration/basic-concepts-of-</w:t>
         </w:r>
-      </w:hyperlink>
-      <w:r>
-        <w:rPr>
-          <w:rFonts w:ascii="Times New Roman" w:hAnsi="Times New Roman" w:cs="Times New Roman"/>
-          <w:lang w:val="pt-BR"/>
-        </w:rPr>
-        <w:t xml:space="preserve">. Acesso em: 6 set. 2026. </w:t>
-      </w:r>
-    </w:p>
-    <w:p>
-      <w:pPr>
-        <w:spacing w:after="0" w:line="240" w:lineRule="auto"/>
-        <w:jc w:val="both"/>
-        <w:rPr>
-          <w:rFonts w:ascii="Times New Roman" w:hAnsi="Times New Roman" w:cs="Times New Roman"/>
-          <w:lang w:val="pt-BR"/>
-        </w:rPr>
-      </w:pPr>
-    </w:p>
-    <w:p>
-      <w:pPr>
-        <w:spacing w:after="0" w:line="240" w:lineRule="auto"/>
-        <w:jc w:val="both"/>
-        <w:rPr>
-          <w:rFonts w:ascii="Times New Roman" w:hAnsi="Times New Roman" w:cs="Times New Roman"/>
-        </w:rPr>
-      </w:pPr>
-      <w:r>
-        <w:rPr>
-          <w:rFonts w:ascii="Times New Roman" w:hAnsi="Times New Roman" w:cs="Times New Roman"/>
-          <w:lang w:val="pt-BR"/>
-        </w:rPr>
-        <w:t xml:space="preserve">TERRA, A. L.; SILVA, E. O. da. </w:t>
-      </w:r>
-      <w:r>
-        <w:rPr>
-          <w:rFonts w:ascii="Times New Roman" w:hAnsi="Times New Roman" w:cs="Times New Roman"/>
-          <w:b/>
-          <w:bCs/>
-          <w:lang w:val="pt-BR"/>
-        </w:rPr>
-        <w:t xml:space="preserve">O uso do Business </w:t>
-      </w:r>
-      <w:proofErr w:type="spellStart"/>
-      <w:r>
-        <w:rPr>
-          <w:rFonts w:ascii="Times New Roman" w:hAnsi="Times New Roman" w:cs="Times New Roman"/>
-          <w:b/>
-          <w:bCs/>
-          <w:lang w:val="pt-BR"/>
-        </w:rPr>
-        <w:t>Intelligence</w:t>
-      </w:r>
-      <w:proofErr w:type="spellEnd"/>
-      <w:r>
-        <w:rPr>
-          <w:rFonts w:ascii="Times New Roman" w:hAnsi="Times New Roman" w:cs="Times New Roman"/>
-          <w:b/>
-          <w:bCs/>
-          <w:lang w:val="pt-BR"/>
-        </w:rPr>
-        <w:t xml:space="preserve"> para análise de dados sobre COVID-19</w:t>
-      </w:r>
-      <w:r>
-        <w:rPr>
-          <w:rFonts w:ascii="Times New Roman" w:hAnsi="Times New Roman" w:cs="Times New Roman"/>
-          <w:lang w:val="pt-BR"/>
-        </w:rPr>
-        <w:t xml:space="preserve">. </w:t>
-      </w:r>
-      <w:r>
-        <w:rPr>
-          <w:rFonts w:ascii="Times New Roman" w:hAnsi="Times New Roman" w:cs="Times New Roman"/>
-          <w:i/>
-          <w:iCs/>
-          <w:lang w:val="pt-BR"/>
-        </w:rPr>
-        <w:t>Caderno de Estudos em Engenharia de Software</w:t>
-      </w:r>
-      <w:r>
-        <w:rPr>
-          <w:rFonts w:ascii="Times New Roman" w:hAnsi="Times New Roman" w:cs="Times New Roman"/>
-          <w:lang w:val="pt-BR"/>
-        </w:rPr>
-        <w:t xml:space="preserve">, v. 2, n. 2, 2022. Disponível em: </w:t>
-      </w:r>
-      <w:r>
-        <w:rPr>
-          <w:rFonts w:ascii="Times New Roman" w:hAnsi="Times New Roman" w:cs="Times New Roman"/>
-          <w:b/>
-          <w:bCs/>
-          <w:lang w:val="pt-BR"/>
-        </w:rPr>
-        <w:t>[INSERIR LINK]</w:t>
-      </w:r>
-      <w:r>
-        <w:rPr>
-          <w:rFonts w:ascii="Times New Roman" w:hAnsi="Times New Roman" w:cs="Times New Roman"/>
-          <w:lang w:val="pt-BR"/>
-        </w:rPr>
-        <w:t xml:space="preserve">. </w:t>
-      </w:r>
-      <w:proofErr w:type="spellStart"/>
-      <w:r>
-        <w:rPr>
-          <w:rFonts w:ascii="Times New Roman" w:hAnsi="Times New Roman" w:cs="Times New Roman"/>
-        </w:rPr>
-        <w:t>Acesso</w:t>
-      </w:r>
-      <w:proofErr w:type="spellEnd"/>
-      <w:r>
-        <w:rPr>
-          <w:rFonts w:ascii="Times New Roman" w:hAnsi="Times New Roman" w:cs="Times New Roman"/>
-        </w:rPr>
-        <w:t xml:space="preserve"> </w:t>
-      </w:r>
-      <w:proofErr w:type="spellStart"/>
-      <w:r>
-        <w:rPr>
-          <w:rFonts w:ascii="Times New Roman" w:hAnsi="Times New Roman" w:cs="Times New Roman"/>
-        </w:rPr>
-        <w:t>em</w:t>
-      </w:r>
-      <w:proofErr w:type="spellEnd"/>
-      <w:r>
-        <w:rPr>
-          <w:rFonts w:ascii="Times New Roman" w:hAnsi="Times New Roman" w:cs="Times New Roman"/>
-        </w:rPr>
-        <w:t>: 6 set. 2026.</w:t>
-      </w:r>
-    </w:p>
-    <w:p>
-      <w:pPr>
-        <w:spacing w:after="0" w:line="240" w:lineRule="auto"/>
-        <w:jc w:val="both"/>
-        <w:rPr>
-          <w:rFonts w:ascii="Times New Roman" w:hAnsi="Times New Roman" w:cs="Times New Roman"/>
-        </w:rPr>
-      </w:pPr>
-    </w:p>
-    <w:p>
-      <w:pPr>
-        <w:spacing w:after="0" w:line="240" w:lineRule="auto"/>
-        <w:jc w:val="both"/>
-        <w:rPr>
-          <w:rFonts w:ascii="Times New Roman" w:hAnsi="Times New Roman" w:cs="Times New Roman"/>
-        </w:rPr>
-      </w:pPr>
-      <w:r>
-        <w:rPr>
-          <w:rFonts w:ascii="Times New Roman" w:hAnsi="Times New Roman" w:cs="Times New Roman"/>
-        </w:rPr>
-        <w:lastRenderedPageBreak/>
-        <w:t xml:space="preserve">TLEMCANI, C.; FAROUKHI, A. Z.; GAHI, Y. From ETL to Modern Data Stack: A Systematic Review and Strategic Implementation Framework. </w:t>
-      </w:r>
-      <w:proofErr w:type="spellStart"/>
-      <w:r>
-        <w:rPr>
-          <w:rFonts w:ascii="Times New Roman" w:hAnsi="Times New Roman" w:cs="Times New Roman"/>
-          <w:b/>
-          <w:bCs/>
-          <w:lang w:val="pt-BR"/>
-        </w:rPr>
-        <w:t>Information</w:t>
-      </w:r>
-      <w:proofErr w:type="spellEnd"/>
-      <w:r>
-        <w:rPr>
-          <w:rFonts w:ascii="Times New Roman" w:hAnsi="Times New Roman" w:cs="Times New Roman"/>
-          <w:lang w:val="pt-BR"/>
-        </w:rPr>
-        <w:t xml:space="preserve">, v. 17, n. 7, art. 630, 2026. DOI: 10.3390/info17070630. Disponível em: </w:t>
-      </w:r>
-      <w:hyperlink r:id="rId24" w:tgtFrame="_blank" w:history="1">
         <w:r>
           <w:rPr>
             <w:rStyle w:val="Hyperlink"/>
             <w:rFonts w:ascii="Times New Roman" w:hAnsi="Times New Roman" w:cs="Times New Roman"/>
             <w:lang w:val="pt-BR"/>
           </w:rPr>
-          <w:t>MDPI – artigo oficial</w:t>
+          <w:t>p</w:t>
+        </w:r>
+        <w:r>
+          <w:rPr>
+            <w:rStyle w:val="Hyperlink"/>
+            <w:rFonts w:ascii="Times New Roman" w:hAnsi="Times New Roman" w:cs="Times New Roman"/>
+            <w:lang w:val="pt-BR"/>
+          </w:rPr>
+          <w:t>di</w:t>
+        </w:r>
+      </w:hyperlink>
+      <w:r>
+        <w:rPr>
+          <w:rFonts w:ascii="Times New Roman" w:hAnsi="Times New Roman" w:cs="Times New Roman"/>
+          <w:lang w:val="pt-BR"/>
+        </w:rPr>
+        <w:t xml:space="preserve">. </w:t>
+      </w:r>
+      <w:r>
+        <w:rPr>
+          <w:rFonts w:ascii="Times New Roman" w:hAnsi="Times New Roman" w:cs="Times New Roman"/>
+          <w:lang w:val="pt-BR"/>
+        </w:rPr>
+        <w:t>Acesso em: 6 set. 2026.</w:t>
+      </w:r>
+    </w:p>
+    <w:p>
+      <w:pPr>
+        <w:spacing w:after="0" w:line="240" w:lineRule="auto"/>
+        <w:jc w:val="both"/>
+        <w:rPr>
+          <w:rFonts w:ascii="Times New Roman" w:hAnsi="Times New Roman" w:cs="Times New Roman"/>
+          <w:lang w:val="pt-BR"/>
+        </w:rPr>
+      </w:pPr>
+    </w:p>
+    <w:p>
+      <w:pPr>
+        <w:spacing w:after="0" w:line="240" w:lineRule="auto"/>
+        <w:jc w:val="both"/>
+        <w:rPr>
+          <w:rFonts w:ascii="Times New Roman" w:hAnsi="Times New Roman" w:cs="Times New Roman"/>
+          <w:lang w:val="pt-BR"/>
+        </w:rPr>
+      </w:pPr>
+      <w:r>
+        <w:rPr>
+          <w:rFonts w:ascii="Times New Roman" w:hAnsi="Times New Roman" w:cs="Times New Roman"/>
+        </w:rPr>
+        <w:t xml:space="preserve">SINGU, S. K. Designing scalable data engineering pipelines using Azure and Databricks. </w:t>
+      </w:r>
+      <w:r>
+        <w:rPr>
+          <w:rFonts w:ascii="Times New Roman" w:hAnsi="Times New Roman" w:cs="Times New Roman"/>
+          <w:b/>
+          <w:bCs/>
+        </w:rPr>
+        <w:t>ESP Journal of Engineering &amp; Technology Advancements</w:t>
+      </w:r>
+      <w:r>
+        <w:rPr>
+          <w:rFonts w:ascii="Times New Roman" w:hAnsi="Times New Roman" w:cs="Times New Roman"/>
+        </w:rPr>
+        <w:t xml:space="preserve">, v. 1, n. 2, p. 176–187, 2021. DOI: 10.56472/25832646/JETA-V1I2P119. </w:t>
+      </w:r>
+      <w:r>
+        <w:rPr>
+          <w:rFonts w:ascii="Times New Roman" w:hAnsi="Times New Roman" w:cs="Times New Roman"/>
+          <w:lang w:val="pt-BR"/>
+        </w:rPr>
+        <w:t>Disponível em:</w:t>
+      </w:r>
+      <w:r>
+        <w:t xml:space="preserve"> </w:t>
+      </w:r>
+      <w:hyperlink r:id="rId24" w:history="1">
+        <w:r>
+          <w:rPr>
+            <w:rStyle w:val="Hyperlink"/>
+          </w:rPr>
+          <w:t>https://www.espjeta.org/jeta-v1i2p119</w:t>
+        </w:r>
+      </w:hyperlink>
+      <w:r>
+        <w:rPr>
+          <w:rFonts w:ascii="Times New Roman" w:hAnsi="Times New Roman" w:cs="Times New Roman"/>
+          <w:lang w:val="pt-BR"/>
+        </w:rPr>
+        <w:t xml:space="preserve">. Acesso em: 6 set. 2026. </w:t>
+      </w:r>
+    </w:p>
+    <w:p>
+      <w:pPr>
+        <w:spacing w:after="0" w:line="240" w:lineRule="auto"/>
+        <w:jc w:val="both"/>
+        <w:rPr>
+          <w:rFonts w:ascii="Times New Roman" w:hAnsi="Times New Roman" w:cs="Times New Roman"/>
+          <w:lang w:val="pt-BR"/>
+        </w:rPr>
+      </w:pPr>
+    </w:p>
+    <w:p>
+      <w:pPr>
+        <w:spacing w:after="0" w:line="240" w:lineRule="auto"/>
+        <w:jc w:val="both"/>
+        <w:rPr>
+          <w:rFonts w:ascii="Times New Roman" w:hAnsi="Times New Roman" w:cs="Times New Roman"/>
+          <w:lang w:val="pt-BR"/>
+        </w:rPr>
+      </w:pPr>
+      <w:r>
+        <w:rPr>
+          <w:rFonts w:ascii="Times New Roman" w:hAnsi="Times New Roman" w:cs="Times New Roman"/>
+          <w:lang w:val="pt-BR"/>
+        </w:rPr>
+        <w:t xml:space="preserve">TERRA, A. L.; SILVA, E. O. da. </w:t>
+      </w:r>
+      <w:r>
+        <w:rPr>
+          <w:rFonts w:ascii="Times New Roman" w:hAnsi="Times New Roman" w:cs="Times New Roman"/>
+          <w:b/>
+          <w:bCs/>
+          <w:lang w:val="pt-BR"/>
+        </w:rPr>
+        <w:t xml:space="preserve">O uso do Business </w:t>
+      </w:r>
+      <w:proofErr w:type="spellStart"/>
+      <w:r>
+        <w:rPr>
+          <w:rFonts w:ascii="Times New Roman" w:hAnsi="Times New Roman" w:cs="Times New Roman"/>
+          <w:b/>
+          <w:bCs/>
+          <w:lang w:val="pt-BR"/>
+        </w:rPr>
+        <w:t>Intelligence</w:t>
+      </w:r>
+      <w:proofErr w:type="spellEnd"/>
+      <w:r>
+        <w:rPr>
+          <w:rFonts w:ascii="Times New Roman" w:hAnsi="Times New Roman" w:cs="Times New Roman"/>
+          <w:b/>
+          <w:bCs/>
+          <w:lang w:val="pt-BR"/>
+        </w:rPr>
+        <w:t xml:space="preserve"> para análise de dados sobre COVID-19</w:t>
+      </w:r>
+      <w:r>
+        <w:rPr>
+          <w:rFonts w:ascii="Times New Roman" w:hAnsi="Times New Roman" w:cs="Times New Roman"/>
+          <w:lang w:val="pt-BR"/>
+        </w:rPr>
+        <w:t xml:space="preserve">. </w:t>
+      </w:r>
+      <w:r>
+        <w:rPr>
+          <w:rFonts w:ascii="Times New Roman" w:hAnsi="Times New Roman" w:cs="Times New Roman"/>
+          <w:i/>
+          <w:iCs/>
+          <w:lang w:val="pt-BR"/>
+        </w:rPr>
+        <w:t>Caderno de Estudos em Engenharia de Software</w:t>
+      </w:r>
+      <w:r>
+        <w:rPr>
+          <w:rFonts w:ascii="Times New Roman" w:hAnsi="Times New Roman" w:cs="Times New Roman"/>
+          <w:lang w:val="pt-BR"/>
+        </w:rPr>
+        <w:t xml:space="preserve">, v. 2, n. 2, 2022. Disponível em: </w:t>
+      </w:r>
+      <w:hyperlink r:id="rId25" w:history="1">
+        <w:r>
+          <w:rPr>
+            <w:rStyle w:val="Hyperlink"/>
+            <w:rFonts w:ascii="Times New Roman" w:hAnsi="Times New Roman" w:cs="Times New Roman"/>
+            <w:lang w:val="pt-BR"/>
+          </w:rPr>
+          <w:t>https://www.scribd.com/document/629765834/2650-71</w:t>
+        </w:r>
+        <w:r>
+          <w:rPr>
+            <w:rStyle w:val="Hyperlink"/>
+            <w:rFonts w:ascii="Times New Roman" w:hAnsi="Times New Roman" w:cs="Times New Roman"/>
+            <w:lang w:val="pt-BR"/>
+          </w:rPr>
+          <w:t>4</w:t>
+        </w:r>
+        <w:r>
+          <w:rPr>
+            <w:rStyle w:val="Hyperlink"/>
+            <w:rFonts w:ascii="Times New Roman" w:hAnsi="Times New Roman" w:cs="Times New Roman"/>
+            <w:lang w:val="pt-BR"/>
+          </w:rPr>
+          <w:t>2-1-PB</w:t>
+        </w:r>
+      </w:hyperlink>
+      <w:r>
+        <w:rPr>
+          <w:rFonts w:ascii="Times New Roman" w:hAnsi="Times New Roman" w:cs="Times New Roman"/>
+          <w:lang w:val="pt-BR"/>
+        </w:rPr>
+        <w:t xml:space="preserve">. </w:t>
+      </w:r>
+      <w:proofErr w:type="gramStart"/>
+      <w:r>
+        <w:rPr>
+          <w:rFonts w:ascii="Times New Roman" w:hAnsi="Times New Roman" w:cs="Times New Roman"/>
+          <w:lang w:val="pt-BR"/>
+        </w:rPr>
+        <w:t>Acesso</w:t>
+      </w:r>
+      <w:proofErr w:type="gramEnd"/>
+      <w:r>
+        <w:rPr>
+          <w:rFonts w:ascii="Times New Roman" w:hAnsi="Times New Roman" w:cs="Times New Roman"/>
+          <w:lang w:val="pt-BR"/>
+        </w:rPr>
+        <w:t xml:space="preserve"> em: 6 set. 2026.</w:t>
+      </w:r>
+    </w:p>
+    <w:p>
+      <w:pPr>
+        <w:spacing w:after="0" w:line="240" w:lineRule="auto"/>
+        <w:jc w:val="both"/>
+        <w:rPr>
+          <w:rFonts w:ascii="Times New Roman" w:hAnsi="Times New Roman" w:cs="Times New Roman"/>
+        </w:rPr>
+      </w:pPr>
+    </w:p>
+    <w:p>
+      <w:pPr>
+        <w:spacing w:after="0" w:line="240" w:lineRule="auto"/>
+        <w:jc w:val="both"/>
+        <w:rPr>
+          <w:rFonts w:ascii="Times New Roman" w:hAnsi="Times New Roman" w:cs="Times New Roman"/>
+        </w:rPr>
+      </w:pPr>
+      <w:r>
+        <w:rPr>
+          <w:rFonts w:ascii="Times New Roman" w:hAnsi="Times New Roman" w:cs="Times New Roman"/>
+        </w:rPr>
+        <w:lastRenderedPageBreak/>
+        <w:t xml:space="preserve">TLEMCANI, C.; FAROUKHI, A. Z.; GAHI, Y. From ETL to Modern Data Stack: A Systematic Review and Strategic Implementation Framework. </w:t>
+      </w:r>
+      <w:proofErr w:type="spellStart"/>
+      <w:r>
+        <w:rPr>
+          <w:rFonts w:ascii="Times New Roman" w:hAnsi="Times New Roman" w:cs="Times New Roman"/>
+          <w:b/>
+          <w:bCs/>
+          <w:lang w:val="pt-BR"/>
+        </w:rPr>
+        <w:t>Information</w:t>
+      </w:r>
+      <w:proofErr w:type="spellEnd"/>
+      <w:r>
+        <w:rPr>
+          <w:rFonts w:ascii="Times New Roman" w:hAnsi="Times New Roman" w:cs="Times New Roman"/>
+          <w:lang w:val="pt-BR"/>
+        </w:rPr>
+        <w:t>, v. 17, n. 7, art. 630, 2026. DOI: 10.3390/info17070630. Disponível em:</w:t>
+      </w:r>
+      <w:r>
+        <w:t xml:space="preserve"> </w:t>
+      </w:r>
+      <w:hyperlink r:id="rId26" w:history="1">
+        <w:r>
+          <w:rPr>
+            <w:rStyle w:val="Hyperlink"/>
+            <w:rFonts w:ascii="Times New Roman" w:hAnsi="Times New Roman" w:cs="Times New Roman"/>
+            <w:lang w:val="pt-BR"/>
+          </w:rPr>
+          <w:t>https://www.mdpi.com/2078-2489/17/7/630</w:t>
         </w:r>
       </w:hyperlink>
       <w:r>
@@ -15925,6 +16006,18 @@
       </w:tblBorders>
     </w:tblPr>
   </w:style>
+  <w:style w:type="character" w:styleId="FollowedHyperlink">
+    <w:name w:val="FollowedHyperlink"/>
+    <w:basedOn w:val="DefaultParagraphFont"/>
+    <w:uiPriority w:val="99"/>
+    <w:semiHidden/>
+    <w:unhideWhenUsed/>
+    <w:rsid w:val="00731C00"/>
+    <w:rPr>
+      <w:color w:val="96607D" w:themeColor="followedHyperlink"/>
+      <w:u w:val="single"/>
+    </w:rPr>
+  </w:style>
 </w:styles>
 </file>
 

</xml_diff>